<commit_message>
Scene layer: keyframe features, metric audit, leave-one-video-out evaluation
</commit_message>
<xml_diff>
--- a/docs/Report_MultiThreaded_Video_Segmentation.docx
+++ b/docs/Report_MultiThreaded_Video_Segmentation.docx
@@ -157,13 +157,27 @@
           <w:b/>
           <w:bCs/>
         </w:rPr>
-        <w:t xml:space="preserve">Scene grouping is weak on real human labels</w:t>
-      </w:r>
-      <w:r>
-        <w:rPr>
-          <w:rFonts w:ascii="Arial" w:cs="Arial" w:eastAsia="Arial" w:hAnsi="Arial"/>
-        </w:rPr>
-        <w:t xml:space="preserve"> (F1 about 0.13 on held-out videos, close to random guessing); this is reported openly in Section 7.7 and in the limitations.</w:t>
+        <w:t xml:space="preserve">Scene grouping is moderate:</w:t>
+      </w:r>
+      <w:r>
+        <w:rPr>
+          <w:rFonts w:ascii="Arial" w:cs="Arial" w:eastAsia="Arial" w:hAnsi="Arial"/>
+        </w:rPr>
+        <w:t xml:space="preserve"> with parameters chosen by leave-one-video-out on all 10 human-labelled videos, boundary F1 is about </w:t>
+      </w:r>
+      <w:r>
+        <w:rPr>
+          <w:rFonts w:ascii="Arial" w:cs="Arial" w:eastAsia="Arial" w:hAnsi="Arial"/>
+          <w:b/>
+          <w:bCs/>
+        </w:rPr>
+        <w:t xml:space="preserve">0.35</w:t>
+      </w:r>
+      <w:r>
+        <w:rPr>
+          <w:rFonts w:ascii="Arial" w:cs="Arial" w:eastAsia="Arial" w:hAnsi="Arial"/>
+        </w:rPr>
+        <w:t xml:space="preserve"> at 2 s tolerance (95% interval 0.25-0.44, 116 true boundaries) against 0.17 for the best trivial baseline. Most of the gain over our earlier 0.13 came from better tuning, not from richer features (Section 7.7).</w:t>
       </w:r>
     </w:p>
     <w:p>
@@ -2815,7 +2829,7 @@
                 <w:sz w:val="18"/>
                 <w:szCs w:val="18"/>
               </w:rPr>
-              <w:t xml:space="preserve">1. Similarity</w:t>
+              <w:t xml:space="preserve">0. Keyframe features</w:t>
             </w:r>
           </w:p>
         </w:tc>
@@ -2848,7 +2862,7 @@
                 <w:sz w:val="18"/>
                 <w:szCs w:val="18"/>
               </w:rPr>
-              <w:t xml:space="preserve">Chi-square distance between each shot and the next T = 18 shots (shot feature = mean histogram of its frames). Independent per pair, so rows are split across pthreads.</w:t>
+              <w:t xml:space="preserve">Each shot is described by 3 to 5 keyframes (at 10-90% of the shot). A keyframe descriptor has three blocks: a global HSV histogram, a 3x3 grid of HSV histograms (keeps layout), and a 3x3 grid of edge-orientation histograms (Sobel, magnitude weighted; texture). Computed by worker threads that split the shots between them (data parallel over shots); about 0.04-0.16 s per video with 8 threads.</w:t>
             </w:r>
           </w:p>
         </w:tc>
@@ -2886,7 +2900,7 @@
                 <w:sz w:val="18"/>
                 <w:szCs w:val="18"/>
               </w:rPr>
-              <w:t xml:space="preserve">2. Shot-thread inference</w:t>
+              <w:t xml:space="preserve">1. Similarity</w:t>
             </w:r>
           </w:p>
         </w:tc>
@@ -2919,7 +2933,7 @@
                 <w:sz w:val="18"/>
                 <w:szCs w:val="18"/>
               </w:rPr>
-              <w:t xml:space="preserve">Viterbi DP: each shot chooses a parent among the previous k = 9 shots (allowed only if distance &lt; tau) or starts a new shot thread; switching the parent offset has a small cost.</w:t>
+              <w:t xml:space="preserve">Distance between each shot and the next T = 18 shots: weighted mean over blocks of the cell-wise chi-square distance, minimum over keyframe pairs. Independent per pair, so rows are split across pthreads. With 3 keyframes this does 9 distance evaluations per pair, which makes the parallel stage heavier.</w:t>
             </w:r>
           </w:p>
         </w:tc>
@@ -2957,7 +2971,7 @@
                 <w:sz w:val="18"/>
                 <w:szCs w:val="18"/>
               </w:rPr>
-              <w:t xml:space="preserve">3. Phases</w:t>
+              <w:t xml:space="preserve">2. Shot-thread inference</w:t>
             </w:r>
           </w:p>
         </w:tc>
@@ -2990,7 +3004,7 @@
                 <w:sz w:val="18"/>
                 <w:szCs w:val="18"/>
               </w:rPr>
-              <w:t xml:space="preserve">Merge shot threads whose shot spans overlap.</w:t>
+              <w:t xml:space="preserve">Viterbi DP: each shot chooses a parent among the previous k = 9 shots (allowed only if distance &lt; tau) or starts a new shot thread; switching the parent offset has a small cost.</w:t>
             </w:r>
           </w:p>
         </w:tc>
@@ -3017,6 +3031,77 @@
           </w:tcPr>
           <w:p>
             <w:pPr>
+              <w:keepNext/>
+              <w:jc w:val="left"/>
+            </w:pPr>
+            <w:r>
+              <w:rPr>
+                <w:rFonts w:ascii="Arial" w:cs="Arial" w:eastAsia="Arial" w:hAnsi="Arial"/>
+                <w:b w:val="false"/>
+                <w:bCs w:val="false"/>
+                <w:sz w:val="18"/>
+                <w:szCs w:val="18"/>
+              </w:rPr>
+              <w:t xml:space="preserve">3. Phases</w:t>
+            </w:r>
+          </w:p>
+        </w:tc>
+        <w:tc>
+          <w:tcPr>
+            <w:tcW w:type="dxa" w:w="7438"/>
+            <w:tcBorders>
+              <w:top w:val="single" w:color="BFC5CC" w:sz="4"/>
+              <w:left w:val="single" w:color="BFC5CC" w:sz="4"/>
+              <w:bottom w:val="single" w:color="BFC5CC" w:sz="4"/>
+              <w:right w:val="single" w:color="BFC5CC" w:sz="4"/>
+            </w:tcBorders>
+            <w:tcMar>
+              <w:top w:type="dxa" w:w="50"/>
+              <w:left w:type="dxa" w:w="90"/>
+              <w:bottom w:type="dxa" w:w="50"/>
+              <w:right w:type="dxa" w:w="90"/>
+            </w:tcMar>
+          </w:tcPr>
+          <w:p>
+            <w:pPr>
+              <w:keepNext/>
+              <w:jc w:val="left"/>
+            </w:pPr>
+            <w:r>
+              <w:rPr>
+                <w:rFonts w:ascii="Arial" w:cs="Arial" w:eastAsia="Arial" w:hAnsi="Arial"/>
+                <w:b w:val="false"/>
+                <w:bCs w:val="false"/>
+                <w:sz w:val="18"/>
+                <w:szCs w:val="18"/>
+              </w:rPr>
+              <w:t xml:space="preserve">Merge shot threads whose shot spans overlap.</w:t>
+            </w:r>
+          </w:p>
+        </w:tc>
+      </w:tr>
+      <w:tr>
+        <w:trPr>
+          <w:cantSplit/>
+        </w:trPr>
+        <w:tc>
+          <w:tcPr>
+            <w:tcW w:type="dxa" w:w="2200"/>
+            <w:tcBorders>
+              <w:top w:val="single" w:color="BFC5CC" w:sz="4"/>
+              <w:left w:val="single" w:color="BFC5CC" w:sz="4"/>
+              <w:bottom w:val="single" w:color="BFC5CC" w:sz="4"/>
+              <w:right w:val="single" w:color="BFC5CC" w:sz="4"/>
+            </w:tcBorders>
+            <w:tcMar>
+              <w:top w:type="dxa" w:w="50"/>
+              <w:left w:type="dxa" w:w="90"/>
+              <w:bottom w:type="dxa" w:w="50"/>
+              <w:right w:type="dxa" w:w="90"/>
+            </w:tcMar>
+          </w:tcPr>
+          <w:p>
+            <w:pPr>
               <w:keepNext w:val="false"/>
               <w:jc w:val="left"/>
             </w:pPr>
@@ -3106,7 +3191,7 @@
         <w:rPr>
           <w:rFonts w:ascii="Arial" w:cs="Arial" w:eastAsia="Arial" w:hAnsi="Arial"/>
         </w:rPr>
-        <w:t xml:space="preserve">. We use a fixed chi-square distance with hand-set parameters. No public code exists for that paper, so the DP is </w:t>
+        <w:t xml:space="preserve">. We use a fixed chi-square distance, equal block weights (1:1:1), and parameters chosen by cross-validation (Section 7.7). No public code exists for that paper, so the DP is </w:t>
       </w:r>
       <w:r>
         <w:rPr>
@@ -5277,7 +5362,546 @@
           <w:sz w:val="18"/>
           <w:szCs w:val="18"/>
         </w:rPr>
-        <w:t xml:space="preserve">scenes.c - scene stage 1: parallel similarity worker (data parallel over rows)</w:t>
+        <w:t xml:space="preserve">features.c - keyframe feature worker: each thread describes the keyframes of its own shots</w:t>
+      </w:r>
+    </w:p>
+    <w:p>
+      <w:pPr>
+        <w:keepLines/>
+        <w:shd w:fill="F3F4F6" w:val="clear"/>
+        <w:spacing w:after="0" w:before="0" w:line="228"/>
+      </w:pPr>
+      <w:r>
+        <w:rPr>
+          <w:rFonts w:ascii="Consolas" w:cs="Consolas" w:eastAsia="Consolas" w:hAnsi="Consolas"/>
+          <w:sz w:val="16"/>
+          <w:szCs w:val="16"/>
+        </w:rPr>
+        <w:t xml:space="preserve">static void *kf_worker(void *arg) {</w:t>
+      </w:r>
+    </w:p>
+    <w:p>
+      <w:pPr>
+        <w:keepLines/>
+        <w:shd w:fill="F3F4F6" w:val="clear"/>
+        <w:spacing w:after="0" w:before="0" w:line="228"/>
+      </w:pPr>
+      <w:r>
+        <w:rPr>
+          <w:rFonts w:ascii="Consolas" w:cs="Consolas" w:eastAsia="Consolas" w:hAnsi="Consolas"/>
+          <w:sz w:val="16"/>
+          <w:szCs w:val="16"/>
+        </w:rPr>
+        <w:t xml:space="preserve">    Job *j = arg;</w:t>
+      </w:r>
+    </w:p>
+    <w:p>
+      <w:pPr>
+        <w:keepLines/>
+        <w:shd w:fill="F3F4F6" w:val="clear"/>
+        <w:spacing w:after="0" w:before="0" w:line="228"/>
+      </w:pPr>
+      <w:r>
+        <w:rPr>
+          <w:rFonts w:ascii="Consolas" w:cs="Consolas" w:eastAsia="Consolas" w:hAnsi="Consolas"/>
+          <w:sz w:val="16"/>
+          <w:szCs w:val="16"/>
+        </w:rPr>
+        <w:t xml:space="preserve">    FILE *f = fopen(j-&gt;v-&gt;path, "rb");</w:t>
+      </w:r>
+    </w:p>
+    <w:p>
+      <w:pPr>
+        <w:keepLines/>
+        <w:shd w:fill="F3F4F6" w:val="clear"/>
+        <w:spacing w:after="0" w:before="0" w:line="228"/>
+      </w:pPr>
+      <w:r>
+        <w:rPr>
+          <w:rFonts w:ascii="Consolas" w:cs="Consolas" w:eastAsia="Consolas" w:hAnsi="Consolas"/>
+          <w:sz w:val="16"/>
+          <w:szCs w:val="16"/>
+        </w:rPr>
+        <w:t xml:space="preserve">    uint8_t *buf = malloc(j-&gt;v-&gt;frame_bytes);</w:t>
+      </w:r>
+    </w:p>
+    <w:p>
+      <w:pPr>
+        <w:keepLines/>
+        <w:shd w:fill="F3F4F6" w:val="clear"/>
+        <w:spacing w:after="0" w:before="0" w:line="228"/>
+      </w:pPr>
+      <w:r>
+        <w:rPr>
+          <w:rFonts w:ascii="Consolas" w:cs="Consolas" w:eastAsia="Consolas" w:hAnsi="Consolas"/>
+          <w:sz w:val="16"/>
+          <w:szCs w:val="16"/>
+        </w:rPr>
+        <w:t xml:space="preserve">    if (!f || !buf) return NULL;</w:t>
+      </w:r>
+    </w:p>
+    <w:p>
+      <w:pPr>
+        <w:keepLines/>
+        <w:shd w:fill="F3F4F6" w:val="clear"/>
+        <w:spacing w:after="0" w:before="0" w:line="228"/>
+      </w:pPr>
+      <w:r>
+        <w:rPr>
+          <w:rFonts w:ascii="Consolas" w:cs="Consolas" w:eastAsia="Consolas" w:hAnsi="Consolas"/>
+          <w:sz w:val="16"/>
+          <w:szCs w:val="16"/>
+        </w:rPr>
+        <w:t xml:space="preserve">    for (long s = j-&gt;lo; s &lt; j-&gt;hi; s++) {</w:t>
+      </w:r>
+    </w:p>
+    <w:p>
+      <w:pPr>
+        <w:keepLines/>
+        <w:shd w:fill="F3F4F6" w:val="clear"/>
+        <w:spacing w:after="0" w:before="0" w:line="228"/>
+      </w:pPr>
+      <w:r>
+        <w:rPr>
+          <w:rFonts w:ascii="Consolas" w:cs="Consolas" w:eastAsia="Consolas" w:hAnsi="Consolas"/>
+          <w:sz w:val="16"/>
+          <w:szCs w:val="16"/>
+        </w:rPr>
+        <w:t xml:space="preserve">        long len = j-&gt;shots[s].end - j-&gt;shots[s].start;</w:t>
+      </w:r>
+    </w:p>
+    <w:p>
+      <w:pPr>
+        <w:keepLines/>
+        <w:shd w:fill="F3F4F6" w:val="clear"/>
+        <w:spacing w:after="0" w:before="0" w:line="228"/>
+      </w:pPr>
+      <w:r>
+        <w:rPr>
+          <w:rFonts w:ascii="Consolas" w:cs="Consolas" w:eastAsia="Consolas" w:hAnsi="Consolas"/>
+          <w:sz w:val="16"/>
+          <w:szCs w:val="16"/>
+        </w:rPr>
+        <w:t xml:space="preserve">        for (int k = 0; k &lt; KF_PER_SHOT; k++) {</w:t>
+      </w:r>
+    </w:p>
+    <w:p>
+      <w:pPr>
+        <w:keepLines/>
+        <w:shd w:fill="F3F4F6" w:val="clear"/>
+        <w:spacing w:after="0" w:before="0" w:line="228"/>
+      </w:pPr>
+      <w:r>
+        <w:rPr>
+          <w:rFonts w:ascii="Consolas" w:cs="Consolas" w:eastAsia="Consolas" w:hAnsi="Consolas"/>
+          <w:sz w:val="16"/>
+          <w:szCs w:val="16"/>
+        </w:rPr>
+        <w:t xml:space="preserve">            long fr = j-&gt;shots[s].start + len * (2 * k + 1) / (2 * KF_PER_SHOT);</w:t>
+      </w:r>
+    </w:p>
+    <w:p>
+      <w:pPr>
+        <w:keepLines/>
+        <w:shd w:fill="F3F4F6" w:val="clear"/>
+        <w:spacing w:after="0" w:before="0" w:line="228"/>
+      </w:pPr>
+      <w:r>
+        <w:rPr>
+          <w:rFonts w:ascii="Consolas" w:cs="Consolas" w:eastAsia="Consolas" w:hAnsi="Consolas"/>
+          <w:sz w:val="16"/>
+          <w:szCs w:val="16"/>
+        </w:rPr>
+        <w:t xml:space="preserve">            fseeko(f, (off_t)fr * (off_t)j-&gt;v-&gt;frame_bytes, SEEK_SET);</w:t>
+      </w:r>
+    </w:p>
+    <w:p>
+      <w:pPr>
+        <w:keepLines/>
+        <w:shd w:fill="F3F4F6" w:val="clear"/>
+        <w:spacing w:after="0" w:before="0" w:line="228"/>
+      </w:pPr>
+      <w:r>
+        <w:rPr>
+          <w:rFonts w:ascii="Consolas" w:cs="Consolas" w:eastAsia="Consolas" w:hAnsi="Consolas"/>
+          <w:sz w:val="16"/>
+          <w:szCs w:val="16"/>
+        </w:rPr>
+        <w:t xml:space="preserve">            float *dst = j-&gt;out + ((size_t)s * KF_PER_SHOT + k) * FD_TOTAL;</w:t>
+      </w:r>
+    </w:p>
+    <w:p>
+      <w:pPr>
+        <w:keepLines/>
+        <w:shd w:fill="F3F4F6" w:val="clear"/>
+        <w:spacing w:after="0" w:before="0" w:line="228"/>
+      </w:pPr>
+      <w:r>
+        <w:rPr>
+          <w:rFonts w:ascii="Consolas" w:cs="Consolas" w:eastAsia="Consolas" w:hAnsi="Consolas"/>
+          <w:sz w:val="16"/>
+          <w:szCs w:val="16"/>
+        </w:rPr>
+        <w:t xml:space="preserve">            if (fread(buf, 1, j-&gt;v-&gt;frame_bytes, f) == j-&gt;v-&gt;frame_bytes)</w:t>
+      </w:r>
+    </w:p>
+    <w:p>
+      <w:pPr>
+        <w:keepLines/>
+        <w:shd w:fill="F3F4F6" w:val="clear"/>
+        <w:spacing w:after="0" w:before="0" w:line="228"/>
+      </w:pPr>
+      <w:r>
+        <w:rPr>
+          <w:rFonts w:ascii="Consolas" w:cs="Consolas" w:eastAsia="Consolas" w:hAnsi="Consolas"/>
+          <w:sz w:val="16"/>
+          <w:szCs w:val="16"/>
+        </w:rPr>
+        <w:t xml:space="preserve">                frame_rich(buf, j-&gt;v-&gt;w, j-&gt;v-&gt;h, dst);</w:t>
+      </w:r>
+    </w:p>
+    <w:p>
+      <w:pPr>
+        <w:keepLines/>
+        <w:shd w:fill="F3F4F6" w:val="clear"/>
+        <w:spacing w:after="0" w:before="0" w:line="228"/>
+      </w:pPr>
+      <w:r>
+        <w:rPr>
+          <w:rFonts w:ascii="Consolas" w:cs="Consolas" w:eastAsia="Consolas" w:hAnsi="Consolas"/>
+          <w:sz w:val="16"/>
+          <w:szCs w:val="16"/>
+        </w:rPr>
+        <w:t xml:space="preserve">        }</w:t>
+      </w:r>
+    </w:p>
+    <w:p>
+      <w:pPr>
+        <w:keepLines/>
+        <w:shd w:fill="F3F4F6" w:val="clear"/>
+        <w:spacing w:after="0" w:before="0" w:line="228"/>
+      </w:pPr>
+      <w:r>
+        <w:rPr>
+          <w:rFonts w:ascii="Consolas" w:cs="Consolas" w:eastAsia="Consolas" w:hAnsi="Consolas"/>
+          <w:sz w:val="16"/>
+          <w:szCs w:val="16"/>
+        </w:rPr>
+        <w:t xml:space="preserve">    }</w:t>
+      </w:r>
+    </w:p>
+    <w:p>
+      <w:pPr>
+        <w:keepLines/>
+        <w:shd w:fill="F3F4F6" w:val="clear"/>
+        <w:spacing w:after="0" w:before="0" w:line="228"/>
+      </w:pPr>
+      <w:r>
+        <w:rPr>
+          <w:rFonts w:ascii="Consolas" w:cs="Consolas" w:eastAsia="Consolas" w:hAnsi="Consolas"/>
+          <w:sz w:val="16"/>
+          <w:szCs w:val="16"/>
+        </w:rPr>
+        <w:t xml:space="preserve">    free(buf);</w:t>
+      </w:r>
+    </w:p>
+    <w:p>
+      <w:pPr>
+        <w:keepLines/>
+        <w:shd w:fill="F3F4F6" w:val="clear"/>
+        <w:spacing w:after="0" w:before="0" w:line="228"/>
+      </w:pPr>
+      <w:r>
+        <w:rPr>
+          <w:rFonts w:ascii="Consolas" w:cs="Consolas" w:eastAsia="Consolas" w:hAnsi="Consolas"/>
+          <w:sz w:val="16"/>
+          <w:szCs w:val="16"/>
+        </w:rPr>
+        <w:t xml:space="preserve">    fclose(f);</w:t>
+      </w:r>
+    </w:p>
+    <w:p>
+      <w:pPr>
+        <w:keepLines/>
+        <w:shd w:fill="F3F4F6" w:val="clear"/>
+        <w:spacing w:after="0" w:before="0" w:line="228"/>
+      </w:pPr>
+      <w:r>
+        <w:rPr>
+          <w:rFonts w:ascii="Consolas" w:cs="Consolas" w:eastAsia="Consolas" w:hAnsi="Consolas"/>
+          <w:sz w:val="16"/>
+          <w:szCs w:val="16"/>
+        </w:rPr>
+        <w:t xml:space="preserve">    return NULL;</w:t>
+      </w:r>
+    </w:p>
+    <w:p>
+      <w:pPr>
+        <w:keepLines/>
+        <w:shd w:fill="F3F4F6" w:val="clear"/>
+        <w:spacing w:after="0" w:before="0" w:line="228"/>
+      </w:pPr>
+      <w:r>
+        <w:rPr>
+          <w:rFonts w:ascii="Consolas" w:cs="Consolas" w:eastAsia="Consolas" w:hAnsi="Consolas"/>
+          <w:sz w:val="16"/>
+          <w:szCs w:val="16"/>
+        </w:rPr>
+        <w:t xml:space="preserve">}</w:t>
+      </w:r>
+    </w:p>
+    <w:p>
+      <w:pPr>
+        <w:spacing w:after="80"/>
+      </w:pPr>
+    </w:p>
+    <w:p>
+      <w:pPr>
+        <w:keepNext/>
+        <w:spacing w:after="40" w:before="140"/>
+      </w:pPr>
+      <w:r>
+        <w:rPr>
+          <w:rFonts w:ascii="Arial" w:cs="Arial" w:eastAsia="Arial" w:hAnsi="Arial"/>
+          <w:b/>
+          <w:bCs/>
+          <w:color w:val="1F3A5F"/>
+          <w:sz w:val="18"/>
+          <w:szCs w:val="18"/>
+        </w:rPr>
+        <w:t xml:space="preserve">scenes.c - descriptor distance (weighted blocks of cell-wise chi-square)</w:t>
+      </w:r>
+    </w:p>
+    <w:p>
+      <w:pPr>
+        <w:keepLines/>
+        <w:shd w:fill="F3F4F6" w:val="clear"/>
+        <w:spacing w:after="0" w:before="0" w:line="228"/>
+      </w:pPr>
+      <w:r>
+        <w:rPr>
+          <w:rFonts w:ascii="Consolas" w:cs="Consolas" w:eastAsia="Consolas" w:hAnsi="Consolas"/>
+          <w:sz w:val="16"/>
+          <w:szCs w:val="16"/>
+        </w:rPr>
+        <w:t xml:space="preserve">static float feat_dist(const float *a, const float *b, const FeatLayout *L) {</w:t>
+      </w:r>
+    </w:p>
+    <w:p>
+      <w:pPr>
+        <w:keepLines/>
+        <w:shd w:fill="F3F4F6" w:val="clear"/>
+        <w:spacing w:after="0" w:before="0" w:line="228"/>
+      </w:pPr>
+      <w:r>
+        <w:rPr>
+          <w:rFonts w:ascii="Consolas" w:cs="Consolas" w:eastAsia="Consolas" w:hAnsi="Consolas"/>
+          <w:sz w:val="16"/>
+          <w:szCs w:val="16"/>
+        </w:rPr>
+        <w:t xml:space="preserve">    float tot = 0.f, ws = 0.f;</w:t>
+      </w:r>
+    </w:p>
+    <w:p>
+      <w:pPr>
+        <w:keepLines/>
+        <w:shd w:fill="F3F4F6" w:val="clear"/>
+        <w:spacing w:after="0" w:before="0" w:line="228"/>
+      </w:pPr>
+      <w:r>
+        <w:rPr>
+          <w:rFonts w:ascii="Consolas" w:cs="Consolas" w:eastAsia="Consolas" w:hAnsi="Consolas"/>
+          <w:sz w:val="16"/>
+          <w:szCs w:val="16"/>
+        </w:rPr>
+        <w:t xml:space="preserve">    for (int k = 0; k &lt; L-&gt;nblocks; k++) {</w:t>
+      </w:r>
+    </w:p>
+    <w:p>
+      <w:pPr>
+        <w:keepLines/>
+        <w:shd w:fill="F3F4F6" w:val="clear"/>
+        <w:spacing w:after="0" w:before="0" w:line="228"/>
+      </w:pPr>
+      <w:r>
+        <w:rPr>
+          <w:rFonts w:ascii="Consolas" w:cs="Consolas" w:eastAsia="Consolas" w:hAnsi="Consolas"/>
+          <w:sz w:val="16"/>
+          <w:szCs w:val="16"/>
+        </w:rPr>
+        <w:t xml:space="preserve">        if (L-&gt;w[k] &lt;= 0) continue;</w:t>
+      </w:r>
+    </w:p>
+    <w:p>
+      <w:pPr>
+        <w:keepLines/>
+        <w:shd w:fill="F3F4F6" w:val="clear"/>
+        <w:spacing w:after="0" w:before="0" w:line="228"/>
+      </w:pPr>
+      <w:r>
+        <w:rPr>
+          <w:rFonts w:ascii="Consolas" w:cs="Consolas" w:eastAsia="Consolas" w:hAnsi="Consolas"/>
+          <w:sz w:val="16"/>
+          <w:szCs w:val="16"/>
+        </w:rPr>
+        <w:t xml:space="preserve">        float d = 0.f;</w:t>
+      </w:r>
+    </w:p>
+    <w:p>
+      <w:pPr>
+        <w:keepLines/>
+        <w:shd w:fill="F3F4F6" w:val="clear"/>
+        <w:spacing w:after="0" w:before="0" w:line="228"/>
+      </w:pPr>
+      <w:r>
+        <w:rPr>
+          <w:rFonts w:ascii="Consolas" w:cs="Consolas" w:eastAsia="Consolas" w:hAnsi="Consolas"/>
+          <w:sz w:val="16"/>
+          <w:szCs w:val="16"/>
+        </w:rPr>
+        <w:t xml:space="preserve">        for (int c = 0; c &lt; L-&gt;ncells[k]; c++) {</w:t>
+      </w:r>
+    </w:p>
+    <w:p>
+      <w:pPr>
+        <w:keepLines/>
+        <w:shd w:fill="F3F4F6" w:val="clear"/>
+        <w:spacing w:after="0" w:before="0" w:line="228"/>
+      </w:pPr>
+      <w:r>
+        <w:rPr>
+          <w:rFonts w:ascii="Consolas" w:cs="Consolas" w:eastAsia="Consolas" w:hAnsi="Consolas"/>
+          <w:sz w:val="16"/>
+          <w:szCs w:val="16"/>
+        </w:rPr>
+        <w:t xml:space="preserve">            int o = L-&gt;off[k] + c * L-&gt;bins[k];</w:t>
+      </w:r>
+    </w:p>
+    <w:p>
+      <w:pPr>
+        <w:keepLines/>
+        <w:shd w:fill="F3F4F6" w:val="clear"/>
+        <w:spacing w:after="0" w:before="0" w:line="228"/>
+      </w:pPr>
+      <w:r>
+        <w:rPr>
+          <w:rFonts w:ascii="Consolas" w:cs="Consolas" w:eastAsia="Consolas" w:hAnsi="Consolas"/>
+          <w:sz w:val="16"/>
+          <w:szCs w:val="16"/>
+        </w:rPr>
+        <w:t xml:space="preserve">            d += chi2n(a + o, b + o, L-&gt;bins[k]);</w:t>
+      </w:r>
+    </w:p>
+    <w:p>
+      <w:pPr>
+        <w:keepLines/>
+        <w:shd w:fill="F3F4F6" w:val="clear"/>
+        <w:spacing w:after="0" w:before="0" w:line="228"/>
+      </w:pPr>
+      <w:r>
+        <w:rPr>
+          <w:rFonts w:ascii="Consolas" w:cs="Consolas" w:eastAsia="Consolas" w:hAnsi="Consolas"/>
+          <w:sz w:val="16"/>
+          <w:szCs w:val="16"/>
+        </w:rPr>
+        <w:t xml:space="preserve">        }</w:t>
+      </w:r>
+    </w:p>
+    <w:p>
+      <w:pPr>
+        <w:keepLines/>
+        <w:shd w:fill="F3F4F6" w:val="clear"/>
+        <w:spacing w:after="0" w:before="0" w:line="228"/>
+      </w:pPr>
+      <w:r>
+        <w:rPr>
+          <w:rFonts w:ascii="Consolas" w:cs="Consolas" w:eastAsia="Consolas" w:hAnsi="Consolas"/>
+          <w:sz w:val="16"/>
+          <w:szCs w:val="16"/>
+        </w:rPr>
+        <w:t xml:space="preserve">        tot += (float)L-&gt;w[k] * d / (float)L-&gt;ncells[k];</w:t>
+      </w:r>
+    </w:p>
+    <w:p>
+      <w:pPr>
+        <w:keepLines/>
+        <w:shd w:fill="F3F4F6" w:val="clear"/>
+        <w:spacing w:after="0" w:before="0" w:line="228"/>
+      </w:pPr>
+      <w:r>
+        <w:rPr>
+          <w:rFonts w:ascii="Consolas" w:cs="Consolas" w:eastAsia="Consolas" w:hAnsi="Consolas"/>
+          <w:sz w:val="16"/>
+          <w:szCs w:val="16"/>
+        </w:rPr>
+        <w:t xml:space="preserve">        ws += (float)L-&gt;w[k];</w:t>
+      </w:r>
+    </w:p>
+    <w:p>
+      <w:pPr>
+        <w:keepLines/>
+        <w:shd w:fill="F3F4F6" w:val="clear"/>
+        <w:spacing w:after="0" w:before="0" w:line="228"/>
+      </w:pPr>
+      <w:r>
+        <w:rPr>
+          <w:rFonts w:ascii="Consolas" w:cs="Consolas" w:eastAsia="Consolas" w:hAnsi="Consolas"/>
+          <w:sz w:val="16"/>
+          <w:szCs w:val="16"/>
+        </w:rPr>
+        <w:t xml:space="preserve">    }</w:t>
+      </w:r>
+    </w:p>
+    <w:p>
+      <w:pPr>
+        <w:keepLines/>
+        <w:shd w:fill="F3F4F6" w:val="clear"/>
+        <w:spacing w:after="0" w:before="0" w:line="228"/>
+      </w:pPr>
+      <w:r>
+        <w:rPr>
+          <w:rFonts w:ascii="Consolas" w:cs="Consolas" w:eastAsia="Consolas" w:hAnsi="Consolas"/>
+          <w:sz w:val="16"/>
+          <w:szCs w:val="16"/>
+        </w:rPr>
+        <w:t xml:space="preserve">    return ws &gt; 0 ? tot / ws : 0.f;</w:t>
+      </w:r>
+    </w:p>
+    <w:p>
+      <w:pPr>
+        <w:keepLines/>
+        <w:shd w:fill="F3F4F6" w:val="clear"/>
+        <w:spacing w:after="0" w:before="0" w:line="228"/>
+      </w:pPr>
+      <w:r>
+        <w:rPr>
+          <w:rFonts w:ascii="Consolas" w:cs="Consolas" w:eastAsia="Consolas" w:hAnsi="Consolas"/>
+          <w:sz w:val="16"/>
+          <w:szCs w:val="16"/>
+        </w:rPr>
+        <w:t xml:space="preserve">}</w:t>
+      </w:r>
+    </w:p>
+    <w:p>
+      <w:pPr>
+        <w:spacing w:after="80"/>
+      </w:pPr>
+    </w:p>
+    <w:p>
+      <w:pPr>
+        <w:keepNext/>
+        <w:spacing w:after="40" w:before="140"/>
+      </w:pPr>
+      <w:r>
+        <w:rPr>
+          <w:rFonts w:ascii="Arial" w:cs="Arial" w:eastAsia="Arial" w:hAnsi="Arial"/>
+          <w:b/>
+          <w:bCs/>
+          <w:color w:val="1F3A5F"/>
+          <w:sz w:val="18"/>
+          <w:szCs w:val="18"/>
+        </w:rPr>
+        <w:t xml:space="preserve">scenes.c - scene stage 1: parallel similarity worker (data parallel over rows, min over keyframe pairs)</w:t>
       </w:r>
     </w:p>
     <w:p>
@@ -5322,6 +5946,21 @@
           <w:sz w:val="16"/>
           <w:szCs w:val="16"/>
         </w:rPr>
+        <w:t xml:space="preserve">    size_t fd = j-&gt;L-&gt;fd;</w:t>
+      </w:r>
+    </w:p>
+    <w:p>
+      <w:pPr>
+        <w:keepLines/>
+        <w:shd w:fill="F3F4F6" w:val="clear"/>
+        <w:spacing w:after="0" w:before="0" w:line="228"/>
+      </w:pPr>
+      <w:r>
+        <w:rPr>
+          <w:rFonts w:ascii="Consolas" w:cs="Consolas" w:eastAsia="Consolas" w:hAnsi="Consolas"/>
+          <w:sz w:val="16"/>
+          <w:szCs w:val="16"/>
+        </w:rPr>
         <w:t xml:space="preserve">    for (long i = j-&gt;lo; i &lt; j-&gt;hi; i++)</w:t>
       </w:r>
     </w:p>
@@ -5337,82 +5976,157 @@
           <w:sz w:val="16"/>
           <w:szCs w:val="16"/>
         </w:rPr>
-        <w:t xml:space="preserve">        for (int o = 1; o &lt;= j-&gt;T; o++)</w:t>
-      </w:r>
-    </w:p>
-    <w:p>
-      <w:pPr>
-        <w:keepLines/>
-        <w:shd w:fill="F3F4F6" w:val="clear"/>
-        <w:spacing w:after="0" w:before="0" w:line="228"/>
-      </w:pPr>
-      <w:r>
-        <w:rPr>
-          <w:rFonts w:ascii="Consolas" w:cs="Consolas" w:eastAsia="Consolas" w:hAnsi="Consolas"/>
-          <w:sz w:val="16"/>
-          <w:szCs w:val="16"/>
-        </w:rPr>
-        <w:t xml:space="preserve">            j-&gt;D[(size_t)i * j-&gt;T + (o - 1)] =</w:t>
-      </w:r>
-    </w:p>
-    <w:p>
-      <w:pPr>
-        <w:keepLines/>
-        <w:shd w:fill="F3F4F6" w:val="clear"/>
-        <w:spacing w:after="0" w:before="0" w:line="228"/>
-      </w:pPr>
-      <w:r>
-        <w:rPr>
-          <w:rFonts w:ascii="Consolas" w:cs="Consolas" w:eastAsia="Consolas" w:hAnsi="Consolas"/>
-          <w:sz w:val="16"/>
-          <w:szCs w:val="16"/>
-        </w:rPr>
-        <w:t xml:space="preserve">                (i + o &lt; j-&gt;ns)</w:t>
-      </w:r>
-    </w:p>
-    <w:p>
-      <w:pPr>
-        <w:keepLines/>
-        <w:shd w:fill="F3F4F6" w:val="clear"/>
-        <w:spacing w:after="0" w:before="0" w:line="228"/>
-      </w:pPr>
-      <w:r>
-        <w:rPr>
-          <w:rFonts w:ascii="Consolas" w:cs="Consolas" w:eastAsia="Consolas" w:hAnsi="Consolas"/>
-          <w:sz w:val="16"/>
-          <w:szCs w:val="16"/>
-        </w:rPr>
-        <w:t xml:space="preserve">                    ? chi2(j-&gt;feat + (size_t)i * NBINS,</w:t>
-      </w:r>
-    </w:p>
-    <w:p>
-      <w:pPr>
-        <w:keepLines/>
-        <w:shd w:fill="F3F4F6" w:val="clear"/>
-        <w:spacing w:after="0" w:before="0" w:line="228"/>
-      </w:pPr>
-      <w:r>
-        <w:rPr>
-          <w:rFonts w:ascii="Consolas" w:cs="Consolas" w:eastAsia="Consolas" w:hAnsi="Consolas"/>
-          <w:sz w:val="16"/>
-          <w:szCs w:val="16"/>
-        </w:rPr>
-        <w:t xml:space="preserve">                           j-&gt;feat + (size_t)(i + o) * NBINS)</w:t>
-      </w:r>
-    </w:p>
-    <w:p>
-      <w:pPr>
-        <w:keepLines/>
-        <w:shd w:fill="F3F4F6" w:val="clear"/>
-        <w:spacing w:after="0" w:before="0" w:line="228"/>
-      </w:pPr>
-      <w:r>
-        <w:rPr>
-          <w:rFonts w:ascii="Consolas" w:cs="Consolas" w:eastAsia="Consolas" w:hAnsi="Consolas"/>
-          <w:sz w:val="16"/>
-          <w:szCs w:val="16"/>
-        </w:rPr>
-        <w:t xml:space="preserve">                    : INF;</w:t>
+        <w:t xml:space="preserve">        for (int o = 1; o &lt;= j-&gt;T; o++) {</w:t>
+      </w:r>
+    </w:p>
+    <w:p>
+      <w:pPr>
+        <w:keepLines/>
+        <w:shd w:fill="F3F4F6" w:val="clear"/>
+        <w:spacing w:after="0" w:before="0" w:line="228"/>
+      </w:pPr>
+      <w:r>
+        <w:rPr>
+          <w:rFonts w:ascii="Consolas" w:cs="Consolas" w:eastAsia="Consolas" w:hAnsi="Consolas"/>
+          <w:sz w:val="16"/>
+          <w:szCs w:val="16"/>
+        </w:rPr>
+        <w:t xml:space="preserve">            float best = INF;</w:t>
+      </w:r>
+    </w:p>
+    <w:p>
+      <w:pPr>
+        <w:keepLines/>
+        <w:shd w:fill="F3F4F6" w:val="clear"/>
+        <w:spacing w:after="0" w:before="0" w:line="228"/>
+      </w:pPr>
+      <w:r>
+        <w:rPr>
+          <w:rFonts w:ascii="Consolas" w:cs="Consolas" w:eastAsia="Consolas" w:hAnsi="Consolas"/>
+          <w:sz w:val="16"/>
+          <w:szCs w:val="16"/>
+        </w:rPr>
+        <w:t xml:space="preserve">            if (i + o &lt; j-&gt;ns)</w:t>
+      </w:r>
+    </w:p>
+    <w:p>
+      <w:pPr>
+        <w:keepLines/>
+        <w:shd w:fill="F3F4F6" w:val="clear"/>
+        <w:spacing w:after="0" w:before="0" w:line="228"/>
+      </w:pPr>
+      <w:r>
+        <w:rPr>
+          <w:rFonts w:ascii="Consolas" w:cs="Consolas" w:eastAsia="Consolas" w:hAnsi="Consolas"/>
+          <w:sz w:val="16"/>
+          <w:szCs w:val="16"/>
+        </w:rPr>
+        <w:t xml:space="preserve">                for (int a = j-&gt;klo; a &lt; j-&gt;khi; a++)</w:t>
+      </w:r>
+    </w:p>
+    <w:p>
+      <w:pPr>
+        <w:keepLines/>
+        <w:shd w:fill="F3F4F6" w:val="clear"/>
+        <w:spacing w:after="0" w:before="0" w:line="228"/>
+      </w:pPr>
+      <w:r>
+        <w:rPr>
+          <w:rFonts w:ascii="Consolas" w:cs="Consolas" w:eastAsia="Consolas" w:hAnsi="Consolas"/>
+          <w:sz w:val="16"/>
+          <w:szCs w:val="16"/>
+        </w:rPr>
+        <w:t xml:space="preserve">                    for (int b = j-&gt;klo; b &lt; j-&gt;khi; b++) {</w:t>
+      </w:r>
+    </w:p>
+    <w:p>
+      <w:pPr>
+        <w:keepLines/>
+        <w:shd w:fill="F3F4F6" w:val="clear"/>
+        <w:spacing w:after="0" w:before="0" w:line="228"/>
+      </w:pPr>
+      <w:r>
+        <w:rPr>
+          <w:rFonts w:ascii="Consolas" w:cs="Consolas" w:eastAsia="Consolas" w:hAnsi="Consolas"/>
+          <w:sz w:val="16"/>
+          <w:szCs w:val="16"/>
+        </w:rPr>
+        <w:t xml:space="preserve">                        float d = feat_dist(j-&gt;kf + ((size_t)i * j-&gt;K + a) * fd,</w:t>
+      </w:r>
+    </w:p>
+    <w:p>
+      <w:pPr>
+        <w:keepLines/>
+        <w:shd w:fill="F3F4F6" w:val="clear"/>
+        <w:spacing w:after="0" w:before="0" w:line="228"/>
+      </w:pPr>
+      <w:r>
+        <w:rPr>
+          <w:rFonts w:ascii="Consolas" w:cs="Consolas" w:eastAsia="Consolas" w:hAnsi="Consolas"/>
+          <w:sz w:val="16"/>
+          <w:szCs w:val="16"/>
+        </w:rPr>
+        <w:t xml:space="preserve">                                            j-&gt;kf + ((size_t)(i + o) * j-&gt;K + b) * fd, j-&gt;L);</w:t>
+      </w:r>
+    </w:p>
+    <w:p>
+      <w:pPr>
+        <w:keepLines/>
+        <w:shd w:fill="F3F4F6" w:val="clear"/>
+        <w:spacing w:after="0" w:before="0" w:line="228"/>
+      </w:pPr>
+      <w:r>
+        <w:rPr>
+          <w:rFonts w:ascii="Consolas" w:cs="Consolas" w:eastAsia="Consolas" w:hAnsi="Consolas"/>
+          <w:sz w:val="16"/>
+          <w:szCs w:val="16"/>
+        </w:rPr>
+        <w:t xml:space="preserve">                        if (d &lt; best) best = d;</w:t>
+      </w:r>
+    </w:p>
+    <w:p>
+      <w:pPr>
+        <w:keepLines/>
+        <w:shd w:fill="F3F4F6" w:val="clear"/>
+        <w:spacing w:after="0" w:before="0" w:line="228"/>
+      </w:pPr>
+      <w:r>
+        <w:rPr>
+          <w:rFonts w:ascii="Consolas" w:cs="Consolas" w:eastAsia="Consolas" w:hAnsi="Consolas"/>
+          <w:sz w:val="16"/>
+          <w:szCs w:val="16"/>
+        </w:rPr>
+        <w:t xml:space="preserve">                    }</w:t>
+      </w:r>
+    </w:p>
+    <w:p>
+      <w:pPr>
+        <w:keepLines/>
+        <w:shd w:fill="F3F4F6" w:val="clear"/>
+        <w:spacing w:after="0" w:before="0" w:line="228"/>
+      </w:pPr>
+      <w:r>
+        <w:rPr>
+          <w:rFonts w:ascii="Consolas" w:cs="Consolas" w:eastAsia="Consolas" w:hAnsi="Consolas"/>
+          <w:sz w:val="16"/>
+          <w:szCs w:val="16"/>
+        </w:rPr>
+        <w:t xml:space="preserve">            j-&gt;D[(size_t)i * j-&gt;T + (o - 1)] = best;</w:t>
+      </w:r>
+    </w:p>
+    <w:p>
+      <w:pPr>
+        <w:keepLines/>
+        <w:shd w:fill="F3F4F6" w:val="clear"/>
+        <w:spacing w:after="0" w:before="0" w:line="228"/>
+      </w:pPr>
+      <w:r>
+        <w:rPr>
+          <w:rFonts w:ascii="Consolas" w:cs="Consolas" w:eastAsia="Consolas" w:hAnsi="Consolas"/>
+          <w:sz w:val="16"/>
+          <w:szCs w:val="16"/>
+        </w:rPr>
+        <w:t xml:space="preserve">        }</w:t>
       </w:r>
     </w:p>
     <w:p>
@@ -14855,41 +15569,252 @@
     </w:p>
     <w:p>
       <w:pPr>
-        <w:spacing w:after="120" w:line="276"/>
-      </w:pPr>
-      <w:r>
-        <w:rPr>
-          <w:rFonts w:ascii="Arial" w:cs="Arial" w:eastAsia="Arial" w:hAnsi="Arial"/>
-        </w:rPr>
-        <w:t xml:space="preserve">The RAI dataset provides human-marked scene boundaries for 10 videos. Scene boundaries have no standard tolerance, so F1 is reported at 1, 2 and 5 seconds. To avoid fooling ourselves, parameters were tuned on </w:t>
-      </w:r>
+        <w:pStyle w:val="Heading2"/>
+        <w:keepNext/>
+        <w:spacing w:after="100" w:before="220"/>
+      </w:pPr>
       <w:r>
         <w:rPr>
           <w:rFonts w:ascii="Arial" w:cs="Arial" w:eastAsia="Arial" w:hAnsi="Arial"/>
           <w:b/>
           <w:bCs/>
-        </w:rPr>
-        <w:t xml:space="preserve">videos 1-5 only</w:t>
-      </w:r>
-      <w:r>
-        <w:rPr>
-          <w:rFonts w:ascii="Arial" w:cs="Arial" w:eastAsia="Arial" w:hAnsi="Arial"/>
-        </w:rPr>
-        <w:t xml:space="preserve"> and scored once on the untouched </w:t>
-      </w:r>
+          <w:color w:val="1F3A5F"/>
+          <w:sz w:val="24"/>
+          <w:szCs w:val="24"/>
+        </w:rPr>
+        <w:t xml:space="preserve">Metric audit (done before tuning)</w:t>
+      </w:r>
+    </w:p>
+    <w:p>
+      <w:pPr>
+        <w:spacing w:after="120" w:line="276"/>
+      </w:pPr>
+      <w:r>
+        <w:rPr>
+          <w:rFonts w:ascii="Arial" w:cs="Arial" w:eastAsia="Arial" w:hAnsi="Arial"/>
+        </w:rPr>
+        <w:t xml:space="preserve">The RAI dataset provides human-marked scene boundaries for 10 videos. Before tuning anything we audited the evaluation (</w:t>
+      </w:r>
+      <w:r>
+        <w:rPr>
+          <w:rFonts w:ascii="Consolas" w:cs="Consolas" w:eastAsia="Consolas" w:hAnsi="Consolas"/>
+          <w:sz w:val="19"/>
+          <w:szCs w:val="19"/>
+        </w:rPr>
+        <w:t xml:space="preserve">tools/audit_metric.py</w:t>
+      </w:r>
+      <w:r>
+        <w:rPr>
+          <w:rFonts w:ascii="Arial" w:cs="Arial" w:eastAsia="Arial" w:hAnsi="Arial"/>
+        </w:rPr>
+        <w:t xml:space="preserve">, output in </w:t>
+      </w:r>
+      <w:r>
+        <w:rPr>
+          <w:rFonts w:ascii="Consolas" w:cs="Consolas" w:eastAsia="Consolas" w:hAnsi="Consolas"/>
+          <w:sz w:val="19"/>
+          <w:szCs w:val="19"/>
+        </w:rPr>
+        <w:t xml:space="preserve">results/audit_metric.md</w:t>
+      </w:r>
+      <w:r>
+        <w:rPr>
+          <w:rFonts w:ascii="Arial" w:cs="Arial" w:eastAsia="Arial" w:hAnsi="Arial"/>
+        </w:rPr>
+        <w:t xml:space="preserve">):</w:t>
+      </w:r>
+    </w:p>
+    <w:p>
+      <w:pPr>
+        <w:pStyle w:val="ListParagraph"/>
+        <w:numPr>
+          <w:ilvl w:val="0"/>
+          <w:numId w:val="3"/>
+        </w:numPr>
+        <w:spacing w:after="60" w:line="264"/>
+      </w:pPr>
       <w:r>
         <w:rPr>
           <w:rFonts w:ascii="Arial" w:cs="Arial" w:eastAsia="Arial" w:hAnsi="Arial"/>
           <w:b/>
           <w:bCs/>
         </w:rPr>
-        <w:t xml:space="preserve">videos 6-10</w:t>
-      </w:r>
-      <w:r>
-        <w:rPr>
-          <w:rFonts w:ascii="Arial" w:cs="Arial" w:eastAsia="Arial" w:hAnsi="Arial"/>
-        </w:rPr>
-        <w:t xml:space="preserve">. Random boundaries (given the true number of scenes) are the chance baseline.</w:t>
+        <w:t xml:space="preserve">Labels are aligned.</w:t>
+      </w:r>
+      <w:r>
+        <w:rPr>
+          <w:rFonts w:ascii="Arial" w:cs="Arial" w:eastAsia="Arial" w:hAnsi="Arial"/>
+        </w:rPr>
+        <w:t xml:space="preserve"> No gaps between scenes, and each video's last labelled frame equals its frame count.</w:t>
+      </w:r>
+    </w:p>
+    <w:p>
+      <w:pPr>
+        <w:pStyle w:val="ListParagraph"/>
+        <w:numPr>
+          <w:ilvl w:val="0"/>
+          <w:numId w:val="3"/>
+        </w:numPr>
+        <w:spacing w:after="60" w:line="264"/>
+      </w:pPr>
+      <w:r>
+        <w:rPr>
+          <w:rFonts w:ascii="Arial" w:cs="Arial" w:eastAsia="Arial" w:hAnsi="Arial"/>
+          <w:b/>
+          <w:bCs/>
+        </w:rPr>
+        <w:t xml:space="preserve">The test set is small:</w:t>
+      </w:r>
+      <w:r>
+        <w:rPr>
+          <w:rFonts w:ascii="Arial" w:cs="Arial" w:eastAsia="Arial" w:hAnsi="Arial"/>
+        </w:rPr>
+        <w:t xml:space="preserve"> 126 scenes, </w:t>
+      </w:r>
+      <w:r>
+        <w:rPr>
+          <w:rFonts w:ascii="Arial" w:cs="Arial" w:eastAsia="Arial" w:hAnsi="Arial"/>
+          <w:b/>
+          <w:bCs/>
+        </w:rPr>
+        <w:t xml:space="preserve">116 true boundaries</w:t>
+      </w:r>
+      <w:r>
+        <w:rPr>
+          <w:rFonts w:ascii="Arial" w:cs="Arial" w:eastAsia="Arial" w:hAnsi="Arial"/>
+        </w:rPr>
+        <w:t xml:space="preserve"> over 10 videos. One video can move a pooled score a lot, so every number carries a resampling interval.</w:t>
+      </w:r>
+    </w:p>
+    <w:p>
+      <w:pPr>
+        <w:pStyle w:val="ListParagraph"/>
+        <w:numPr>
+          <w:ilvl w:val="0"/>
+          <w:numId w:val="3"/>
+        </w:numPr>
+        <w:spacing w:after="60" w:line="264"/>
+      </w:pPr>
+      <w:r>
+        <w:rPr>
+          <w:rFonts w:ascii="Arial" w:cs="Arial" w:eastAsia="Arial" w:hAnsi="Arial"/>
+          <w:b/>
+          <w:bCs/>
+        </w:rPr>
+        <w:t xml:space="preserve">The scorer is correct.</w:t>
+      </w:r>
+      <w:r>
+        <w:rPr>
+          <w:rFonts w:ascii="Arial" w:cs="Arial" w:eastAsia="Arial" w:hAnsi="Arial"/>
+        </w:rPr>
+        <w:t xml:space="preserve"> A clean re-implementation (optimal one-to-one matching) reproduces the earlier scores exactly (0.105 / 0.105 / 0.144 at 1 / 2 / 5 s for the default parameters).</w:t>
+      </w:r>
+    </w:p>
+    <w:p>
+      <w:pPr>
+        <w:pStyle w:val="ListParagraph"/>
+        <w:numPr>
+          <w:ilvl w:val="0"/>
+          <w:numId w:val="3"/>
+        </w:numPr>
+        <w:spacing w:after="60" w:line="264"/>
+      </w:pPr>
+      <w:r>
+        <w:rPr>
+          <w:rFonts w:ascii="Arial" w:cs="Arial" w:eastAsia="Arial" w:hAnsi="Arial"/>
+          <w:b/>
+          <w:bCs/>
+        </w:rPr>
+        <w:t xml:space="preserve">Shot detection is not the bottleneck:</w:t>
+      </w:r>
+      <w:r>
+        <w:rPr>
+          <w:rFonts w:ascii="Arial" w:cs="Arial" w:eastAsia="Arial" w:hAnsi="Arial"/>
+        </w:rPr>
+        <w:t xml:space="preserve"> 91% of true scene boundaries lie within 2 s of a detected cut (97% within 5 s; 84% within 1 s).</w:t>
+      </w:r>
+    </w:p>
+    <w:p>
+      <w:pPr>
+        <w:pStyle w:val="ListParagraph"/>
+        <w:numPr>
+          <w:ilvl w:val="0"/>
+          <w:numId w:val="3"/>
+        </w:numPr>
+        <w:spacing w:after="60" w:line="264"/>
+      </w:pPr>
+      <w:r>
+        <w:rPr>
+          <w:rFonts w:ascii="Arial" w:cs="Arial" w:eastAsia="Arial" w:hAnsi="Arial"/>
+          <w:b/>
+          <w:bCs/>
+        </w:rPr>
+        <w:t xml:space="preserve">The earlier random baseline was too weak.</w:t>
+      </w:r>
+      <w:r>
+        <w:rPr>
+          <w:rFonts w:ascii="Arial" w:cs="Arial" w:eastAsia="Arial" w:hAnsi="Arial"/>
+        </w:rPr>
+        <w:t xml:space="preserve"> Calling every detected cut a scene boundary scores F1 0.167 at 2 s, and evenly spaced scenes score 0.172 at 5 s. A scene method has to beat these, not random guessing.</w:t>
+      </w:r>
+    </w:p>
+    <w:p>
+      <w:pPr>
+        <w:pStyle w:val="ListParagraph"/>
+        <w:numPr>
+          <w:ilvl w:val="0"/>
+          <w:numId w:val="3"/>
+        </w:numPr>
+        <w:spacing w:after="60" w:line="264"/>
+      </w:pPr>
+      <w:r>
+        <w:rPr>
+          <w:rFonts w:ascii="Arial" w:cs="Arial" w:eastAsia="Arial" w:hAnsi="Arial"/>
+        </w:rPr>
+        <w:t xml:space="preserve">Coverage/overflow was also tried and dropped: our implementation could not be verified against a reference and gave implausible values.</w:t>
+      </w:r>
+    </w:p>
+    <w:p>
+      <w:pPr>
+        <w:pStyle w:val="Heading2"/>
+        <w:keepNext/>
+        <w:spacing w:after="100" w:before="220"/>
+      </w:pPr>
+      <w:r>
+        <w:rPr>
+          <w:rFonts w:ascii="Arial" w:cs="Arial" w:eastAsia="Arial" w:hAnsi="Arial"/>
+          <w:b/>
+          <w:bCs/>
+          <w:color w:val="1F3A5F"/>
+          <w:sz w:val="24"/>
+          <w:szCs w:val="24"/>
+        </w:rPr>
+        <w:t xml:space="preserve">Leave-one-video-out comparison of features</w:t>
+      </w:r>
+    </w:p>
+    <w:p>
+      <w:pPr>
+        <w:spacing w:after="120" w:line="276"/>
+      </w:pPr>
+      <w:r>
+        <w:rPr>
+          <w:rFonts w:ascii="Arial" w:cs="Arial" w:eastAsia="Arial" w:hAnsi="Arial"/>
+        </w:rPr>
+        <w:t xml:space="preserve">For each feature set and each video, the scene parameters (tau, new-thread cost, parent-switch cost, new-scene cost, maximum phases per scene; 672 combinations) are chosen </w:t>
+      </w:r>
+      <w:r>
+        <w:rPr>
+          <w:rFonts w:ascii="Arial" w:cs="Arial" w:eastAsia="Arial" w:hAnsi="Arial"/>
+          <w:b/>
+          <w:bCs/>
+        </w:rPr>
+        <w:t xml:space="preserve">only on the other 9 videos</w:t>
+      </w:r>
+      <w:r>
+        <w:rPr>
+          <w:rFonts w:ascii="Arial" w:cs="Arial" w:eastAsia="Arial" w:hAnsi="Arial"/>
+        </w:rPr>
+        <w:t xml:space="preserve"> by maximising pooled F1 at 2 s, then scored on the held-out video. Results are pooled over the 10 held-out videos. The main method, fixed in advance, is the full descriptor with 3 keyframes; the other rows are ablations.</w:t>
       </w:r>
     </w:p>
     <w:tbl>
@@ -14905,11 +15830,13 @@
         </w:tblBorders>
       </w:tblPr>
       <w:tblGrid>
-        <w:gridCol w:w="4100"/>
+        <w:gridCol w:w="3000"/>
+        <w:gridCol w:w="700"/>
+        <w:gridCol w:w="800"/>
+        <w:gridCol w:w="700"/>
         <w:gridCol w:w="1100"/>
-        <w:gridCol w:w="1300"/>
-        <w:gridCol w:w="1100"/>
-        <w:gridCol w:w="2038"/>
+        <w:gridCol w:w="1250"/>
+        <w:gridCol w:w="2088"/>
       </w:tblGrid>
       <w:tr>
         <w:trPr>
@@ -14917,7 +15844,7 @@
         </w:trPr>
         <w:tc>
           <w:tcPr>
-            <w:tcW w:type="dxa" w:w="4100"/>
+            <w:tcW w:type="dxa" w:w="3000"/>
             <w:tcBorders>
               <w:top w:val="single" w:color="BFC5CC" w:sz="4"/>
               <w:left w:val="single" w:color="BFC5CC" w:sz="4"/>
@@ -14945,13 +15872,13 @@
                 <w:sz w:val="18"/>
                 <w:szCs w:val="18"/>
               </w:rPr>
-              <w:t xml:space="preserve">Setting</w:t>
-            </w:r>
-          </w:p>
-        </w:tc>
-        <w:tc>
-          <w:tcPr>
-            <w:tcW w:type="dxa" w:w="1100"/>
+              <w:t xml:space="preserve">Features</w:t>
+            </w:r>
+          </w:p>
+        </w:tc>
+        <w:tc>
+          <w:tcPr>
+            <w:tcW w:type="dxa" w:w="700"/>
             <w:tcBorders>
               <w:top w:val="single" w:color="BFC5CC" w:sz="4"/>
               <w:left w:val="single" w:color="BFC5CC" w:sz="4"/>
@@ -14979,13 +15906,13 @@
                 <w:sz w:val="18"/>
                 <w:szCs w:val="18"/>
               </w:rPr>
-              <w:t xml:space="preserve">F1 at 1 s</w:t>
-            </w:r>
-          </w:p>
-        </w:tc>
-        <w:tc>
-          <w:tcPr>
-            <w:tcW w:type="dxa" w:w="1300"/>
+              <w:t xml:space="preserve">F1 1 s</w:t>
+            </w:r>
+          </w:p>
+        </w:tc>
+        <w:tc>
+          <w:tcPr>
+            <w:tcW w:type="dxa" w:w="800"/>
             <w:tcBorders>
               <w:top w:val="single" w:color="BFC5CC" w:sz="4"/>
               <w:left w:val="single" w:color="BFC5CC" w:sz="4"/>
@@ -15013,13 +15940,13 @@
                 <w:sz w:val="18"/>
                 <w:szCs w:val="18"/>
               </w:rPr>
-              <w:t xml:space="preserve">F1 at 2 s</w:t>
-            </w:r>
-          </w:p>
-        </w:tc>
-        <w:tc>
-          <w:tcPr>
-            <w:tcW w:type="dxa" w:w="1100"/>
+              <w:t xml:space="preserve">F1 2 s</w:t>
+            </w:r>
+          </w:p>
+        </w:tc>
+        <w:tc>
+          <w:tcPr>
+            <w:tcW w:type="dxa" w:w="700"/>
             <w:tcBorders>
               <w:top w:val="single" w:color="BFC5CC" w:sz="4"/>
               <w:left w:val="single" w:color="BFC5CC" w:sz="4"/>
@@ -15047,13 +15974,13 @@
                 <w:sz w:val="18"/>
                 <w:szCs w:val="18"/>
               </w:rPr>
-              <w:t xml:space="preserve">F1 at 5 s</w:t>
-            </w:r>
-          </w:p>
-        </w:tc>
-        <w:tc>
-          <w:tcPr>
-            <w:tcW w:type="dxa" w:w="2038"/>
+              <w:t xml:space="preserve">F1 5 s</w:t>
+            </w:r>
+          </w:p>
+        </w:tc>
+        <w:tc>
+          <w:tcPr>
+            <w:tcW w:type="dxa" w:w="1100"/>
             <w:tcBorders>
               <w:top w:val="single" w:color="BFC5CC" w:sz="4"/>
               <w:left w:val="single" w:color="BFC5CC" w:sz="4"/>
@@ -15082,6 +16009,74 @@
                 <w:szCs w:val="18"/>
               </w:rPr>
               <w:t xml:space="preserve">P / R at 2 s</w:t>
+            </w:r>
+          </w:p>
+        </w:tc>
+        <w:tc>
+          <w:tcPr>
+            <w:tcW w:type="dxa" w:w="1250"/>
+            <w:tcBorders>
+              <w:top w:val="single" w:color="BFC5CC" w:sz="4"/>
+              <w:left w:val="single" w:color="BFC5CC" w:sz="4"/>
+              <w:bottom w:val="single" w:color="BFC5CC" w:sz="4"/>
+              <w:right w:val="single" w:color="BFC5CC" w:sz="4"/>
+            </w:tcBorders>
+            <w:shd w:fill="DCE6F2" w:val="clear"/>
+            <w:tcMar>
+              <w:top w:type="dxa" w:w="50"/>
+              <w:left w:type="dxa" w:w="90"/>
+              <w:bottom w:type="dxa" w:w="50"/>
+              <w:right w:type="dxa" w:w="90"/>
+            </w:tcMar>
+          </w:tcPr>
+          <w:p>
+            <w:pPr>
+              <w:keepNext/>
+              <w:jc w:val="left"/>
+            </w:pPr>
+            <w:r>
+              <w:rPr>
+                <w:rFonts w:ascii="Arial" w:cs="Arial" w:eastAsia="Arial" w:hAnsi="Arial"/>
+                <w:b/>
+                <w:bCs/>
+                <w:sz w:val="18"/>
+                <w:szCs w:val="18"/>
+              </w:rPr>
+              <w:t xml:space="preserve">Pred. / true scenes</w:t>
+            </w:r>
+          </w:p>
+        </w:tc>
+        <w:tc>
+          <w:tcPr>
+            <w:tcW w:type="dxa" w:w="2088"/>
+            <w:tcBorders>
+              <w:top w:val="single" w:color="BFC5CC" w:sz="4"/>
+              <w:left w:val="single" w:color="BFC5CC" w:sz="4"/>
+              <w:bottom w:val="single" w:color="BFC5CC" w:sz="4"/>
+              <w:right w:val="single" w:color="BFC5CC" w:sz="4"/>
+            </w:tcBorders>
+            <w:shd w:fill="DCE6F2" w:val="clear"/>
+            <w:tcMar>
+              <w:top w:type="dxa" w:w="50"/>
+              <w:left w:type="dxa" w:w="90"/>
+              <w:bottom w:type="dxa" w:w="50"/>
+              <w:right w:type="dxa" w:w="90"/>
+            </w:tcMar>
+          </w:tcPr>
+          <w:p>
+            <w:pPr>
+              <w:keepNext/>
+              <w:jc w:val="left"/>
+            </w:pPr>
+            <w:r>
+              <w:rPr>
+                <w:rFonts w:ascii="Arial" w:cs="Arial" w:eastAsia="Arial" w:hAnsi="Arial"/>
+                <w:b/>
+                <w:bCs/>
+                <w:sz w:val="18"/>
+                <w:szCs w:val="18"/>
+              </w:rPr>
+              <w:t xml:space="preserve">F1 2 s interval</w:t>
             </w:r>
           </w:p>
         </w:tc>
@@ -15092,7 +16087,7 @@
         </w:trPr>
         <w:tc>
           <w:tcPr>
-            <w:tcW w:type="dxa" w:w="4100"/>
+            <w:tcW w:type="dxa" w:w="3000"/>
             <w:tcBorders>
               <w:top w:val="single" w:color="BFC5CC" w:sz="4"/>
               <w:left w:val="single" w:color="BFC5CC" w:sz="4"/>
@@ -15119,7 +16114,106 @@
                 <w:sz w:val="18"/>
                 <w:szCs w:val="18"/>
               </w:rPr>
-              <w:t xml:space="preserve">Default parameters, all 10 videos</w:t>
+              <w:t xml:space="preserve">Old method (mean global histogram), properly tuned</w:t>
+            </w:r>
+          </w:p>
+        </w:tc>
+        <w:tc>
+          <w:tcPr>
+            <w:tcW w:type="dxa" w:w="700"/>
+            <w:tcBorders>
+              <w:top w:val="single" w:color="BFC5CC" w:sz="4"/>
+              <w:left w:val="single" w:color="BFC5CC" w:sz="4"/>
+              <w:bottom w:val="single" w:color="BFC5CC" w:sz="4"/>
+              <w:right w:val="single" w:color="BFC5CC" w:sz="4"/>
+            </w:tcBorders>
+            <w:tcMar>
+              <w:top w:type="dxa" w:w="50"/>
+              <w:left w:type="dxa" w:w="90"/>
+              <w:bottom w:type="dxa" w:w="50"/>
+              <w:right w:type="dxa" w:w="90"/>
+            </w:tcMar>
+          </w:tcPr>
+          <w:p>
+            <w:pPr>
+              <w:keepNext/>
+              <w:jc w:val="center"/>
+            </w:pPr>
+            <w:r>
+              <w:rPr>
+                <w:rFonts w:ascii="Arial" w:cs="Arial" w:eastAsia="Arial" w:hAnsi="Arial"/>
+                <w:b w:val="false"/>
+                <w:bCs w:val="false"/>
+                <w:sz w:val="18"/>
+                <w:szCs w:val="18"/>
+              </w:rPr>
+              <w:t xml:space="preserve">0.219</w:t>
+            </w:r>
+          </w:p>
+        </w:tc>
+        <w:tc>
+          <w:tcPr>
+            <w:tcW w:type="dxa" w:w="800"/>
+            <w:tcBorders>
+              <w:top w:val="single" w:color="BFC5CC" w:sz="4"/>
+              <w:left w:val="single" w:color="BFC5CC" w:sz="4"/>
+              <w:bottom w:val="single" w:color="BFC5CC" w:sz="4"/>
+              <w:right w:val="single" w:color="BFC5CC" w:sz="4"/>
+            </w:tcBorders>
+            <w:tcMar>
+              <w:top w:type="dxa" w:w="50"/>
+              <w:left w:type="dxa" w:w="90"/>
+              <w:bottom w:type="dxa" w:w="50"/>
+              <w:right w:type="dxa" w:w="90"/>
+            </w:tcMar>
+          </w:tcPr>
+          <w:p>
+            <w:pPr>
+              <w:keepNext/>
+              <w:jc w:val="center"/>
+            </w:pPr>
+            <w:r>
+              <w:rPr>
+                <w:rFonts w:ascii="Arial" w:cs="Arial" w:eastAsia="Arial" w:hAnsi="Arial"/>
+                <w:b w:val="false"/>
+                <w:bCs w:val="false"/>
+                <w:sz w:val="18"/>
+                <w:szCs w:val="18"/>
+              </w:rPr>
+              <w:t xml:space="preserve">0.287</w:t>
+            </w:r>
+          </w:p>
+        </w:tc>
+        <w:tc>
+          <w:tcPr>
+            <w:tcW w:type="dxa" w:w="700"/>
+            <w:tcBorders>
+              <w:top w:val="single" w:color="BFC5CC" w:sz="4"/>
+              <w:left w:val="single" w:color="BFC5CC" w:sz="4"/>
+              <w:bottom w:val="single" w:color="BFC5CC" w:sz="4"/>
+              <w:right w:val="single" w:color="BFC5CC" w:sz="4"/>
+            </w:tcBorders>
+            <w:tcMar>
+              <w:top w:type="dxa" w:w="50"/>
+              <w:left w:type="dxa" w:w="90"/>
+              <w:bottom w:type="dxa" w:w="50"/>
+              <w:right w:type="dxa" w:w="90"/>
+            </w:tcMar>
+          </w:tcPr>
+          <w:p>
+            <w:pPr>
+              <w:keepNext/>
+              <w:jc w:val="center"/>
+            </w:pPr>
+            <w:r>
+              <w:rPr>
+                <w:rFonts w:ascii="Arial" w:cs="Arial" w:eastAsia="Arial" w:hAnsi="Arial"/>
+                <w:b w:val="false"/>
+                <w:bCs w:val="false"/>
+                <w:sz w:val="18"/>
+                <w:szCs w:val="18"/>
+              </w:rPr>
+              <w:t xml:space="preserve">0.362</w:t>
             </w:r>
           </w:p>
         </w:tc>
@@ -15152,13 +16246,13 @@
                 <w:sz w:val="18"/>
                 <w:szCs w:val="18"/>
               </w:rPr>
-              <w:t xml:space="preserve">0.105</w:t>
-            </w:r>
-          </w:p>
-        </w:tc>
-        <w:tc>
-          <w:tcPr>
-            <w:tcW w:type="dxa" w:w="1300"/>
+              <w:t xml:space="preserve">0.26 / 0.33</w:t>
+            </w:r>
+          </w:p>
+        </w:tc>
+        <w:tc>
+          <w:tcPr>
+            <w:tcW w:type="dxa" w:w="1250"/>
             <w:tcBorders>
               <w:top w:val="single" w:color="BFC5CC" w:sz="4"/>
               <w:left w:val="single" w:color="BFC5CC" w:sz="4"/>
@@ -15185,13 +16279,13 @@
                 <w:sz w:val="18"/>
                 <w:szCs w:val="18"/>
               </w:rPr>
-              <w:t xml:space="preserve">0.105</w:t>
-            </w:r>
-          </w:p>
-        </w:tc>
-        <w:tc>
-          <w:tcPr>
-            <w:tcW w:type="dxa" w:w="1100"/>
+              <w:t xml:space="preserve">159 / 126</w:t>
+            </w:r>
+          </w:p>
+        </w:tc>
+        <w:tc>
+          <w:tcPr>
+            <w:tcW w:type="dxa" w:w="2088"/>
             <w:tcBorders>
               <w:top w:val="single" w:color="BFC5CC" w:sz="4"/>
               <w:left w:val="single" w:color="BFC5CC" w:sz="4"/>
@@ -15218,40 +16312,7 @@
                 <w:sz w:val="18"/>
                 <w:szCs w:val="18"/>
               </w:rPr>
-              <w:t xml:space="preserve">0.144</w:t>
-            </w:r>
-          </w:p>
-        </w:tc>
-        <w:tc>
-          <w:tcPr>
-            <w:tcW w:type="dxa" w:w="2038"/>
-            <w:tcBorders>
-              <w:top w:val="single" w:color="BFC5CC" w:sz="4"/>
-              <w:left w:val="single" w:color="BFC5CC" w:sz="4"/>
-              <w:bottom w:val="single" w:color="BFC5CC" w:sz="4"/>
-              <w:right w:val="single" w:color="BFC5CC" w:sz="4"/>
-            </w:tcBorders>
-            <w:tcMar>
-              <w:top w:type="dxa" w:w="50"/>
-              <w:left w:type="dxa" w:w="90"/>
-              <w:bottom w:type="dxa" w:w="50"/>
-              <w:right w:type="dxa" w:w="90"/>
-            </w:tcMar>
-          </w:tcPr>
-          <w:p>
-            <w:pPr>
-              <w:keepNext/>
-              <w:jc w:val="center"/>
-            </w:pPr>
-            <w:r>
-              <w:rPr>
-                <w:rFonts w:ascii="Arial" w:cs="Arial" w:eastAsia="Arial" w:hAnsi="Arial"/>
-                <w:b w:val="false"/>
-                <w:bCs w:val="false"/>
-                <w:sz w:val="18"/>
-                <w:szCs w:val="18"/>
-              </w:rPr>
-              <w:t xml:space="preserve">0.22 / 0.07</w:t>
+              <w:t xml:space="preserve">0.20-0.36</w:t>
             </w:r>
           </w:p>
         </w:tc>
@@ -15262,7 +16323,7 @@
         </w:trPr>
         <w:tc>
           <w:tcPr>
-            <w:tcW w:type="dxa" w:w="4100"/>
+            <w:tcW w:type="dxa" w:w="3000"/>
             <w:tcBorders>
               <w:top w:val="single" w:color="BFC5CC" w:sz="4"/>
               <w:left w:val="single" w:color="BFC5CC" w:sz="4"/>
@@ -15289,7 +16350,106 @@
                 <w:sz w:val="18"/>
                 <w:szCs w:val="18"/>
               </w:rPr>
-              <w:t xml:space="preserve">Tuned on videos 1-5, scored on the same 5 (optimistic)</w:t>
+              <w:t xml:space="preserve">Global histogram, 1 keyframe</w:t>
+            </w:r>
+          </w:p>
+        </w:tc>
+        <w:tc>
+          <w:tcPr>
+            <w:tcW w:type="dxa" w:w="700"/>
+            <w:tcBorders>
+              <w:top w:val="single" w:color="BFC5CC" w:sz="4"/>
+              <w:left w:val="single" w:color="BFC5CC" w:sz="4"/>
+              <w:bottom w:val="single" w:color="BFC5CC" w:sz="4"/>
+              <w:right w:val="single" w:color="BFC5CC" w:sz="4"/>
+            </w:tcBorders>
+            <w:tcMar>
+              <w:top w:type="dxa" w:w="50"/>
+              <w:left w:type="dxa" w:w="90"/>
+              <w:bottom w:type="dxa" w:w="50"/>
+              <w:right w:type="dxa" w:w="90"/>
+            </w:tcMar>
+          </w:tcPr>
+          <w:p>
+            <w:pPr>
+              <w:keepNext/>
+              <w:jc w:val="center"/>
+            </w:pPr>
+            <w:r>
+              <w:rPr>
+                <w:rFonts w:ascii="Arial" w:cs="Arial" w:eastAsia="Arial" w:hAnsi="Arial"/>
+                <w:b w:val="false"/>
+                <w:bCs w:val="false"/>
+                <w:sz w:val="18"/>
+                <w:szCs w:val="18"/>
+              </w:rPr>
+              <w:t xml:space="preserve">0.249</w:t>
+            </w:r>
+          </w:p>
+        </w:tc>
+        <w:tc>
+          <w:tcPr>
+            <w:tcW w:type="dxa" w:w="800"/>
+            <w:tcBorders>
+              <w:top w:val="single" w:color="BFC5CC" w:sz="4"/>
+              <w:left w:val="single" w:color="BFC5CC" w:sz="4"/>
+              <w:bottom w:val="single" w:color="BFC5CC" w:sz="4"/>
+              <w:right w:val="single" w:color="BFC5CC" w:sz="4"/>
+            </w:tcBorders>
+            <w:tcMar>
+              <w:top w:type="dxa" w:w="50"/>
+              <w:left w:type="dxa" w:w="90"/>
+              <w:bottom w:type="dxa" w:w="50"/>
+              <w:right w:type="dxa" w:w="90"/>
+            </w:tcMar>
+          </w:tcPr>
+          <w:p>
+            <w:pPr>
+              <w:keepNext/>
+              <w:jc w:val="center"/>
+            </w:pPr>
+            <w:r>
+              <w:rPr>
+                <w:rFonts w:ascii="Arial" w:cs="Arial" w:eastAsia="Arial" w:hAnsi="Arial"/>
+                <w:b w:val="false"/>
+                <w:bCs w:val="false"/>
+                <w:sz w:val="18"/>
+                <w:szCs w:val="18"/>
+              </w:rPr>
+              <w:t xml:space="preserve">0.304</w:t>
+            </w:r>
+          </w:p>
+        </w:tc>
+        <w:tc>
+          <w:tcPr>
+            <w:tcW w:type="dxa" w:w="700"/>
+            <w:tcBorders>
+              <w:top w:val="single" w:color="BFC5CC" w:sz="4"/>
+              <w:left w:val="single" w:color="BFC5CC" w:sz="4"/>
+              <w:bottom w:val="single" w:color="BFC5CC" w:sz="4"/>
+              <w:right w:val="single" w:color="BFC5CC" w:sz="4"/>
+            </w:tcBorders>
+            <w:tcMar>
+              <w:top w:type="dxa" w:w="50"/>
+              <w:left w:type="dxa" w:w="90"/>
+              <w:bottom w:type="dxa" w:w="50"/>
+              <w:right w:type="dxa" w:w="90"/>
+            </w:tcMar>
+          </w:tcPr>
+          <w:p>
+            <w:pPr>
+              <w:keepNext/>
+              <w:jc w:val="center"/>
+            </w:pPr>
+            <w:r>
+              <w:rPr>
+                <w:rFonts w:ascii="Arial" w:cs="Arial" w:eastAsia="Arial" w:hAnsi="Arial"/>
+                <w:b w:val="false"/>
+                <w:bCs w:val="false"/>
+                <w:sz w:val="18"/>
+                <w:szCs w:val="18"/>
+              </w:rPr>
+              <w:t xml:space="preserve">0.405</w:t>
             </w:r>
           </w:p>
         </w:tc>
@@ -15322,13 +16482,13 @@
                 <w:sz w:val="18"/>
                 <w:szCs w:val="18"/>
               </w:rPr>
-              <w:t xml:space="preserve">0.365</w:t>
-            </w:r>
-          </w:p>
-        </w:tc>
-        <w:tc>
-          <w:tcPr>
-            <w:tcW w:type="dxa" w:w="1300"/>
+              <w:t xml:space="preserve">0.28 / 0.34</w:t>
+            </w:r>
+          </w:p>
+        </w:tc>
+        <w:tc>
+          <w:tcPr>
+            <w:tcW w:type="dxa" w:w="1250"/>
             <w:tcBorders>
               <w:top w:val="single" w:color="BFC5CC" w:sz="4"/>
               <w:left w:val="single" w:color="BFC5CC" w:sz="4"/>
@@ -15355,13 +16515,13 @@
                 <w:sz w:val="18"/>
                 <w:szCs w:val="18"/>
               </w:rPr>
-              <w:t xml:space="preserve">0.446</w:t>
-            </w:r>
-          </w:p>
-        </w:tc>
-        <w:tc>
-          <w:tcPr>
-            <w:tcW w:type="dxa" w:w="1100"/>
+              <w:t xml:space="preserve">151 / 126</w:t>
+            </w:r>
+          </w:p>
+        </w:tc>
+        <w:tc>
+          <w:tcPr>
+            <w:tcW w:type="dxa" w:w="2088"/>
             <w:tcBorders>
               <w:top w:val="single" w:color="BFC5CC" w:sz="4"/>
               <w:left w:val="single" w:color="BFC5CC" w:sz="4"/>
@@ -15388,40 +16548,7 @@
                 <w:sz w:val="18"/>
                 <w:szCs w:val="18"/>
               </w:rPr>
-              <w:t xml:space="preserve">0.514</w:t>
-            </w:r>
-          </w:p>
-        </w:tc>
-        <w:tc>
-          <w:tcPr>
-            <w:tcW w:type="dxa" w:w="2038"/>
-            <w:tcBorders>
-              <w:top w:val="single" w:color="BFC5CC" w:sz="4"/>
-              <w:left w:val="single" w:color="BFC5CC" w:sz="4"/>
-              <w:bottom w:val="single" w:color="BFC5CC" w:sz="4"/>
-              <w:right w:val="single" w:color="BFC5CC" w:sz="4"/>
-            </w:tcBorders>
-            <w:tcMar>
-              <w:top w:type="dxa" w:w="50"/>
-              <w:left w:type="dxa" w:w="90"/>
-              <w:bottom w:type="dxa" w:w="50"/>
-              <w:right w:type="dxa" w:w="90"/>
-            </w:tcMar>
-          </w:tcPr>
-          <w:p>
-            <w:pPr>
-              <w:keepNext/>
-              <w:jc w:val="center"/>
-            </w:pPr>
-            <w:r>
-              <w:rPr>
-                <w:rFonts w:ascii="Arial" w:cs="Arial" w:eastAsia="Arial" w:hAnsi="Arial"/>
-                <w:b w:val="false"/>
-                <w:bCs w:val="false"/>
-                <w:sz w:val="18"/>
-                <w:szCs w:val="18"/>
-              </w:rPr>
-              <w:t xml:space="preserve">0.40 / 0.51</w:t>
+              <w:t xml:space="preserve">0.22-0.36</w:t>
             </w:r>
           </w:p>
         </w:tc>
@@ -15432,7 +16559,7 @@
         </w:trPr>
         <w:tc>
           <w:tcPr>
-            <w:tcW w:type="dxa" w:w="4100"/>
+            <w:tcW w:type="dxa" w:w="3000"/>
             <w:tcBorders>
               <w:top w:val="single" w:color="BFC5CC" w:sz="4"/>
               <w:left w:val="single" w:color="BFC5CC" w:sz="4"/>
@@ -15459,7 +16586,106 @@
                 <w:sz w:val="18"/>
                 <w:szCs w:val="18"/>
               </w:rPr>
-              <w:t xml:space="preserve">Same parameters, unseen videos 6-10 (honest)</w:t>
+              <w:t xml:space="preserve">Global histogram, 3 keyframes</w:t>
+            </w:r>
+          </w:p>
+        </w:tc>
+        <w:tc>
+          <w:tcPr>
+            <w:tcW w:type="dxa" w:w="700"/>
+            <w:tcBorders>
+              <w:top w:val="single" w:color="BFC5CC" w:sz="4"/>
+              <w:left w:val="single" w:color="BFC5CC" w:sz="4"/>
+              <w:bottom w:val="single" w:color="BFC5CC" w:sz="4"/>
+              <w:right w:val="single" w:color="BFC5CC" w:sz="4"/>
+            </w:tcBorders>
+            <w:tcMar>
+              <w:top w:type="dxa" w:w="50"/>
+              <w:left w:type="dxa" w:w="90"/>
+              <w:bottom w:type="dxa" w:w="50"/>
+              <w:right w:type="dxa" w:w="90"/>
+            </w:tcMar>
+          </w:tcPr>
+          <w:p>
+            <w:pPr>
+              <w:keepNext/>
+              <w:jc w:val="center"/>
+            </w:pPr>
+            <w:r>
+              <w:rPr>
+                <w:rFonts w:ascii="Arial" w:cs="Arial" w:eastAsia="Arial" w:hAnsi="Arial"/>
+                <w:b w:val="false"/>
+                <w:bCs w:val="false"/>
+                <w:sz w:val="18"/>
+                <w:szCs w:val="18"/>
+              </w:rPr>
+              <w:t xml:space="preserve">0.242</w:t>
+            </w:r>
+          </w:p>
+        </w:tc>
+        <w:tc>
+          <w:tcPr>
+            <w:tcW w:type="dxa" w:w="800"/>
+            <w:tcBorders>
+              <w:top w:val="single" w:color="BFC5CC" w:sz="4"/>
+              <w:left w:val="single" w:color="BFC5CC" w:sz="4"/>
+              <w:bottom w:val="single" w:color="BFC5CC" w:sz="4"/>
+              <w:right w:val="single" w:color="BFC5CC" w:sz="4"/>
+            </w:tcBorders>
+            <w:tcMar>
+              <w:top w:type="dxa" w:w="50"/>
+              <w:left w:type="dxa" w:w="90"/>
+              <w:bottom w:type="dxa" w:w="50"/>
+              <w:right w:type="dxa" w:w="90"/>
+            </w:tcMar>
+          </w:tcPr>
+          <w:p>
+            <w:pPr>
+              <w:keepNext/>
+              <w:jc w:val="center"/>
+            </w:pPr>
+            <w:r>
+              <w:rPr>
+                <w:rFonts w:ascii="Arial" w:cs="Arial" w:eastAsia="Arial" w:hAnsi="Arial"/>
+                <w:b w:val="false"/>
+                <w:bCs w:val="false"/>
+                <w:sz w:val="18"/>
+                <w:szCs w:val="18"/>
+              </w:rPr>
+              <w:t xml:space="preserve">0.304</w:t>
+            </w:r>
+          </w:p>
+        </w:tc>
+        <w:tc>
+          <w:tcPr>
+            <w:tcW w:type="dxa" w:w="700"/>
+            <w:tcBorders>
+              <w:top w:val="single" w:color="BFC5CC" w:sz="4"/>
+              <w:left w:val="single" w:color="BFC5CC" w:sz="4"/>
+              <w:bottom w:val="single" w:color="BFC5CC" w:sz="4"/>
+              <w:right w:val="single" w:color="BFC5CC" w:sz="4"/>
+            </w:tcBorders>
+            <w:tcMar>
+              <w:top w:type="dxa" w:w="50"/>
+              <w:left w:type="dxa" w:w="90"/>
+              <w:bottom w:type="dxa" w:w="50"/>
+              <w:right w:type="dxa" w:w="90"/>
+            </w:tcMar>
+          </w:tcPr>
+          <w:p>
+            <w:pPr>
+              <w:keepNext/>
+              <w:jc w:val="center"/>
+            </w:pPr>
+            <w:r>
+              <w:rPr>
+                <w:rFonts w:ascii="Arial" w:cs="Arial" w:eastAsia="Arial" w:hAnsi="Arial"/>
+                <w:b w:val="false"/>
+                <w:bCs w:val="false"/>
+                <w:sz w:val="18"/>
+                <w:szCs w:val="18"/>
+              </w:rPr>
+              <w:t xml:space="preserve">0.394</w:t>
             </w:r>
           </w:p>
         </w:tc>
@@ -15492,13 +16718,13 @@
                 <w:sz w:val="18"/>
                 <w:szCs w:val="18"/>
               </w:rPr>
-              <w:t xml:space="preserve">0.067</w:t>
-            </w:r>
-          </w:p>
-        </w:tc>
-        <w:tc>
-          <w:tcPr>
-            <w:tcW w:type="dxa" w:w="1300"/>
+              <w:t xml:space="preserve">0.25 / 0.38</w:t>
+            </w:r>
+          </w:p>
+        </w:tc>
+        <w:tc>
+          <w:tcPr>
+            <w:tcW w:type="dxa" w:w="1250"/>
             <w:tcBorders>
               <w:top w:val="single" w:color="BFC5CC" w:sz="4"/>
               <w:left w:val="single" w:color="BFC5CC" w:sz="4"/>
@@ -15525,13 +16751,13 @@
                 <w:sz w:val="18"/>
                 <w:szCs w:val="18"/>
               </w:rPr>
-              <w:t xml:space="preserve">0.133</w:t>
-            </w:r>
-          </w:p>
-        </w:tc>
-        <w:tc>
-          <w:tcPr>
-            <w:tcW w:type="dxa" w:w="1100"/>
+              <w:t xml:space="preserve">183 / 126</w:t>
+            </w:r>
+          </w:p>
+        </w:tc>
+        <w:tc>
+          <w:tcPr>
+            <w:tcW w:type="dxa" w:w="2088"/>
             <w:tcBorders>
               <w:top w:val="single" w:color="BFC5CC" w:sz="4"/>
               <w:left w:val="single" w:color="BFC5CC" w:sz="4"/>
@@ -15558,40 +16784,7 @@
                 <w:sz w:val="18"/>
                 <w:szCs w:val="18"/>
               </w:rPr>
-              <w:t xml:space="preserve">0.200</w:t>
-            </w:r>
-          </w:p>
-        </w:tc>
-        <w:tc>
-          <w:tcPr>
-            <w:tcW w:type="dxa" w:w="2038"/>
-            <w:tcBorders>
-              <w:top w:val="single" w:color="BFC5CC" w:sz="4"/>
-              <w:left w:val="single" w:color="BFC5CC" w:sz="4"/>
-              <w:bottom w:val="single" w:color="BFC5CC" w:sz="4"/>
-              <w:right w:val="single" w:color="BFC5CC" w:sz="4"/>
-            </w:tcBorders>
-            <w:tcMar>
-              <w:top w:type="dxa" w:w="50"/>
-              <w:left w:type="dxa" w:w="90"/>
-              <w:bottom w:type="dxa" w:w="50"/>
-              <w:right w:type="dxa" w:w="90"/>
-            </w:tcMar>
-          </w:tcPr>
-          <w:p>
-            <w:pPr>
-              <w:keepNext/>
-              <w:jc w:val="center"/>
-            </w:pPr>
-            <w:r>
-              <w:rPr>
-                <w:rFonts w:ascii="Arial" w:cs="Arial" w:eastAsia="Arial" w:hAnsi="Arial"/>
-                <w:b w:val="false"/>
-                <w:bCs w:val="false"/>
-                <w:sz w:val="18"/>
-                <w:szCs w:val="18"/>
-              </w:rPr>
-              <w:t xml:space="preserve">0.15 / 0.12</w:t>
+              <w:t xml:space="preserve">0.23-0.36</w:t>
             </w:r>
           </w:p>
         </w:tc>
@@ -15602,7 +16795,7 @@
         </w:trPr>
         <w:tc>
           <w:tcPr>
-            <w:tcW w:type="dxa" w:w="4100"/>
+            <w:tcW w:type="dxa" w:w="3000"/>
             <w:tcBorders>
               <w:top w:val="single" w:color="BFC5CC" w:sz="4"/>
               <w:left w:val="single" w:color="BFC5CC" w:sz="4"/>
@@ -15629,7 +16822,106 @@
                 <w:sz w:val="18"/>
                 <w:szCs w:val="18"/>
               </w:rPr>
-              <w:t xml:space="preserve">Random boundaries, videos 6-10</w:t>
+              <w:t xml:space="preserve">Spatial 3x3 colour grid, 3 keyframes</w:t>
+            </w:r>
+          </w:p>
+        </w:tc>
+        <w:tc>
+          <w:tcPr>
+            <w:tcW w:type="dxa" w:w="700"/>
+            <w:tcBorders>
+              <w:top w:val="single" w:color="BFC5CC" w:sz="4"/>
+              <w:left w:val="single" w:color="BFC5CC" w:sz="4"/>
+              <w:bottom w:val="single" w:color="BFC5CC" w:sz="4"/>
+              <w:right w:val="single" w:color="BFC5CC" w:sz="4"/>
+            </w:tcBorders>
+            <w:tcMar>
+              <w:top w:type="dxa" w:w="50"/>
+              <w:left w:type="dxa" w:w="90"/>
+              <w:bottom w:type="dxa" w:w="50"/>
+              <w:right w:type="dxa" w:w="90"/>
+            </w:tcMar>
+          </w:tcPr>
+          <w:p>
+            <w:pPr>
+              <w:keepNext/>
+              <w:jc w:val="center"/>
+            </w:pPr>
+            <w:r>
+              <w:rPr>
+                <w:rFonts w:ascii="Arial" w:cs="Arial" w:eastAsia="Arial" w:hAnsi="Arial"/>
+                <w:b w:val="false"/>
+                <w:bCs w:val="false"/>
+                <w:sz w:val="18"/>
+                <w:szCs w:val="18"/>
+              </w:rPr>
+              <w:t xml:space="preserve">0.247</w:t>
+            </w:r>
+          </w:p>
+        </w:tc>
+        <w:tc>
+          <w:tcPr>
+            <w:tcW w:type="dxa" w:w="800"/>
+            <w:tcBorders>
+              <w:top w:val="single" w:color="BFC5CC" w:sz="4"/>
+              <w:left w:val="single" w:color="BFC5CC" w:sz="4"/>
+              <w:bottom w:val="single" w:color="BFC5CC" w:sz="4"/>
+              <w:right w:val="single" w:color="BFC5CC" w:sz="4"/>
+            </w:tcBorders>
+            <w:tcMar>
+              <w:top w:type="dxa" w:w="50"/>
+              <w:left w:type="dxa" w:w="90"/>
+              <w:bottom w:type="dxa" w:w="50"/>
+              <w:right w:type="dxa" w:w="90"/>
+            </w:tcMar>
+          </w:tcPr>
+          <w:p>
+            <w:pPr>
+              <w:keepNext/>
+              <w:jc w:val="center"/>
+            </w:pPr>
+            <w:r>
+              <w:rPr>
+                <w:rFonts w:ascii="Arial" w:cs="Arial" w:eastAsia="Arial" w:hAnsi="Arial"/>
+                <w:b w:val="false"/>
+                <w:bCs w:val="false"/>
+                <w:sz w:val="18"/>
+                <w:szCs w:val="18"/>
+              </w:rPr>
+              <w:t xml:space="preserve">0.290</w:t>
+            </w:r>
+          </w:p>
+        </w:tc>
+        <w:tc>
+          <w:tcPr>
+            <w:tcW w:type="dxa" w:w="700"/>
+            <w:tcBorders>
+              <w:top w:val="single" w:color="BFC5CC" w:sz="4"/>
+              <w:left w:val="single" w:color="BFC5CC" w:sz="4"/>
+              <w:bottom w:val="single" w:color="BFC5CC" w:sz="4"/>
+              <w:right w:val="single" w:color="BFC5CC" w:sz="4"/>
+            </w:tcBorders>
+            <w:tcMar>
+              <w:top w:type="dxa" w:w="50"/>
+              <w:left w:type="dxa" w:w="90"/>
+              <w:bottom w:type="dxa" w:w="50"/>
+              <w:right w:type="dxa" w:w="90"/>
+            </w:tcMar>
+          </w:tcPr>
+          <w:p>
+            <w:pPr>
+              <w:keepNext/>
+              <w:jc w:val="center"/>
+            </w:pPr>
+            <w:r>
+              <w:rPr>
+                <w:rFonts w:ascii="Arial" w:cs="Arial" w:eastAsia="Arial" w:hAnsi="Arial"/>
+                <w:b w:val="false"/>
+                <w:bCs w:val="false"/>
+                <w:sz w:val="18"/>
+                <w:szCs w:val="18"/>
+              </w:rPr>
+              <w:t xml:space="preserve">0.328</w:t>
             </w:r>
           </w:p>
         </w:tc>
@@ -15662,13 +16954,13 @@
                 <w:sz w:val="18"/>
                 <w:szCs w:val="18"/>
               </w:rPr>
-              <w:t xml:space="preserve">-</w:t>
-            </w:r>
-          </w:p>
-        </w:tc>
-        <w:tc>
-          <w:tcPr>
-            <w:tcW w:type="dxa" w:w="1300"/>
+              <w:t xml:space="preserve">0.19 / 0.59</w:t>
+            </w:r>
+          </w:p>
+        </w:tc>
+        <w:tc>
+          <w:tcPr>
+            <w:tcW w:type="dxa" w:w="1250"/>
             <w:tcBorders>
               <w:top w:val="single" w:color="BFC5CC" w:sz="4"/>
               <w:left w:val="single" w:color="BFC5CC" w:sz="4"/>
@@ -15695,13 +16987,13 @@
                 <w:sz w:val="18"/>
                 <w:szCs w:val="18"/>
               </w:rPr>
-              <w:t xml:space="preserve">0.073</w:t>
-            </w:r>
-          </w:p>
-        </w:tc>
-        <w:tc>
-          <w:tcPr>
-            <w:tcW w:type="dxa" w:w="1100"/>
+              <w:t xml:space="preserve">363 / 126</w:t>
+            </w:r>
+          </w:p>
+        </w:tc>
+        <w:tc>
+          <w:tcPr>
+            <w:tcW w:type="dxa" w:w="2088"/>
             <w:tcBorders>
               <w:top w:val="single" w:color="BFC5CC" w:sz="4"/>
               <w:left w:val="single" w:color="BFC5CC" w:sz="4"/>
@@ -15728,40 +17020,7 @@
                 <w:sz w:val="18"/>
                 <w:szCs w:val="18"/>
               </w:rPr>
-              <w:t xml:space="preserve">0.171</w:t>
-            </w:r>
-          </w:p>
-        </w:tc>
-        <w:tc>
-          <w:tcPr>
-            <w:tcW w:type="dxa" w:w="2038"/>
-            <w:tcBorders>
-              <w:top w:val="single" w:color="BFC5CC" w:sz="4"/>
-              <w:left w:val="single" w:color="BFC5CC" w:sz="4"/>
-              <w:bottom w:val="single" w:color="BFC5CC" w:sz="4"/>
-              <w:right w:val="single" w:color="BFC5CC" w:sz="4"/>
-            </w:tcBorders>
-            <w:tcMar>
-              <w:top w:type="dxa" w:w="50"/>
-              <w:left w:type="dxa" w:w="90"/>
-              <w:bottom w:type="dxa" w:w="50"/>
-              <w:right w:type="dxa" w:w="90"/>
-            </w:tcMar>
-          </w:tcPr>
-          <w:p>
-            <w:pPr>
-              <w:keepNext/>
-              <w:jc w:val="center"/>
-            </w:pPr>
-            <w:r>
-              <w:rPr>
-                <w:rFonts w:ascii="Arial" w:cs="Arial" w:eastAsia="Arial" w:hAnsi="Arial"/>
-                <w:b w:val="false"/>
-                <w:bCs w:val="false"/>
-                <w:sz w:val="18"/>
-                <w:szCs w:val="18"/>
-              </w:rPr>
-              <w:t xml:space="preserve">-</w:t>
+              <w:t xml:space="preserve">0.23-0.35</w:t>
             </w:r>
           </w:p>
         </w:tc>
@@ -15772,7 +17031,1187 @@
         </w:trPr>
         <w:tc>
           <w:tcPr>
-            <w:tcW w:type="dxa" w:w="4100"/>
+            <w:tcW w:type="dxa" w:w="3000"/>
+            <w:tcBorders>
+              <w:top w:val="single" w:color="BFC5CC" w:sz="4"/>
+              <w:left w:val="single" w:color="BFC5CC" w:sz="4"/>
+              <w:bottom w:val="single" w:color="BFC5CC" w:sz="4"/>
+              <w:right w:val="single" w:color="BFC5CC" w:sz="4"/>
+            </w:tcBorders>
+            <w:tcMar>
+              <w:top w:type="dxa" w:w="50"/>
+              <w:left w:type="dxa" w:w="90"/>
+              <w:bottom w:type="dxa" w:w="50"/>
+              <w:right w:type="dxa" w:w="90"/>
+            </w:tcMar>
+          </w:tcPr>
+          <w:p>
+            <w:pPr>
+              <w:keepNext/>
+              <w:jc w:val="left"/>
+            </w:pPr>
+            <w:r>
+              <w:rPr>
+                <w:rFonts w:ascii="Arial" w:cs="Arial" w:eastAsia="Arial" w:hAnsi="Arial"/>
+                <w:b w:val="false"/>
+                <w:bCs w:val="false"/>
+                <w:sz w:val="18"/>
+                <w:szCs w:val="18"/>
+              </w:rPr>
+              <w:t xml:space="preserve">Edge orientation 3x3, 3 keyframes</w:t>
+            </w:r>
+          </w:p>
+        </w:tc>
+        <w:tc>
+          <w:tcPr>
+            <w:tcW w:type="dxa" w:w="700"/>
+            <w:tcBorders>
+              <w:top w:val="single" w:color="BFC5CC" w:sz="4"/>
+              <w:left w:val="single" w:color="BFC5CC" w:sz="4"/>
+              <w:bottom w:val="single" w:color="BFC5CC" w:sz="4"/>
+              <w:right w:val="single" w:color="BFC5CC" w:sz="4"/>
+            </w:tcBorders>
+            <w:tcMar>
+              <w:top w:type="dxa" w:w="50"/>
+              <w:left w:type="dxa" w:w="90"/>
+              <w:bottom w:type="dxa" w:w="50"/>
+              <w:right w:type="dxa" w:w="90"/>
+            </w:tcMar>
+          </w:tcPr>
+          <w:p>
+            <w:pPr>
+              <w:keepNext/>
+              <w:jc w:val="center"/>
+            </w:pPr>
+            <w:r>
+              <w:rPr>
+                <w:rFonts w:ascii="Arial" w:cs="Arial" w:eastAsia="Arial" w:hAnsi="Arial"/>
+                <w:b w:val="false"/>
+                <w:bCs w:val="false"/>
+                <w:sz w:val="18"/>
+                <w:szCs w:val="18"/>
+              </w:rPr>
+              <w:t xml:space="preserve">0.161</w:t>
+            </w:r>
+          </w:p>
+        </w:tc>
+        <w:tc>
+          <w:tcPr>
+            <w:tcW w:type="dxa" w:w="800"/>
+            <w:tcBorders>
+              <w:top w:val="single" w:color="BFC5CC" w:sz="4"/>
+              <w:left w:val="single" w:color="BFC5CC" w:sz="4"/>
+              <w:bottom w:val="single" w:color="BFC5CC" w:sz="4"/>
+              <w:right w:val="single" w:color="BFC5CC" w:sz="4"/>
+            </w:tcBorders>
+            <w:tcMar>
+              <w:top w:type="dxa" w:w="50"/>
+              <w:left w:type="dxa" w:w="90"/>
+              <w:bottom w:type="dxa" w:w="50"/>
+              <w:right w:type="dxa" w:w="90"/>
+            </w:tcMar>
+          </w:tcPr>
+          <w:p>
+            <w:pPr>
+              <w:keepNext/>
+              <w:jc w:val="center"/>
+            </w:pPr>
+            <w:r>
+              <w:rPr>
+                <w:rFonts w:ascii="Arial" w:cs="Arial" w:eastAsia="Arial" w:hAnsi="Arial"/>
+                <w:b w:val="false"/>
+                <w:bCs w:val="false"/>
+                <w:sz w:val="18"/>
+                <w:szCs w:val="18"/>
+              </w:rPr>
+              <w:t xml:space="preserve">0.239</w:t>
+            </w:r>
+          </w:p>
+        </w:tc>
+        <w:tc>
+          <w:tcPr>
+            <w:tcW w:type="dxa" w:w="700"/>
+            <w:tcBorders>
+              <w:top w:val="single" w:color="BFC5CC" w:sz="4"/>
+              <w:left w:val="single" w:color="BFC5CC" w:sz="4"/>
+              <w:bottom w:val="single" w:color="BFC5CC" w:sz="4"/>
+              <w:right w:val="single" w:color="BFC5CC" w:sz="4"/>
+            </w:tcBorders>
+            <w:tcMar>
+              <w:top w:type="dxa" w:w="50"/>
+              <w:left w:type="dxa" w:w="90"/>
+              <w:bottom w:type="dxa" w:w="50"/>
+              <w:right w:type="dxa" w:w="90"/>
+            </w:tcMar>
+          </w:tcPr>
+          <w:p>
+            <w:pPr>
+              <w:keepNext/>
+              <w:jc w:val="center"/>
+            </w:pPr>
+            <w:r>
+              <w:rPr>
+                <w:rFonts w:ascii="Arial" w:cs="Arial" w:eastAsia="Arial" w:hAnsi="Arial"/>
+                <w:b w:val="false"/>
+                <w:bCs w:val="false"/>
+                <w:sz w:val="18"/>
+                <w:szCs w:val="18"/>
+              </w:rPr>
+              <w:t xml:space="preserve">0.367</w:t>
+            </w:r>
+          </w:p>
+        </w:tc>
+        <w:tc>
+          <w:tcPr>
+            <w:tcW w:type="dxa" w:w="1100"/>
+            <w:tcBorders>
+              <w:top w:val="single" w:color="BFC5CC" w:sz="4"/>
+              <w:left w:val="single" w:color="BFC5CC" w:sz="4"/>
+              <w:bottom w:val="single" w:color="BFC5CC" w:sz="4"/>
+              <w:right w:val="single" w:color="BFC5CC" w:sz="4"/>
+            </w:tcBorders>
+            <w:tcMar>
+              <w:top w:type="dxa" w:w="50"/>
+              <w:left w:type="dxa" w:w="90"/>
+              <w:bottom w:type="dxa" w:w="50"/>
+              <w:right w:type="dxa" w:w="90"/>
+            </w:tcMar>
+          </w:tcPr>
+          <w:p>
+            <w:pPr>
+              <w:keepNext/>
+              <w:jc w:val="center"/>
+            </w:pPr>
+            <w:r>
+              <w:rPr>
+                <w:rFonts w:ascii="Arial" w:cs="Arial" w:eastAsia="Arial" w:hAnsi="Arial"/>
+                <w:b w:val="false"/>
+                <w:bCs w:val="false"/>
+                <w:sz w:val="18"/>
+                <w:szCs w:val="18"/>
+              </w:rPr>
+              <w:t xml:space="preserve">0.18 / 0.37</w:t>
+            </w:r>
+          </w:p>
+        </w:tc>
+        <w:tc>
+          <w:tcPr>
+            <w:tcW w:type="dxa" w:w="1250"/>
+            <w:tcBorders>
+              <w:top w:val="single" w:color="BFC5CC" w:sz="4"/>
+              <w:left w:val="single" w:color="BFC5CC" w:sz="4"/>
+              <w:bottom w:val="single" w:color="BFC5CC" w:sz="4"/>
+              <w:right w:val="single" w:color="BFC5CC" w:sz="4"/>
+            </w:tcBorders>
+            <w:tcMar>
+              <w:top w:type="dxa" w:w="50"/>
+              <w:left w:type="dxa" w:w="90"/>
+              <w:bottom w:type="dxa" w:w="50"/>
+              <w:right w:type="dxa" w:w="90"/>
+            </w:tcMar>
+          </w:tcPr>
+          <w:p>
+            <w:pPr>
+              <w:keepNext/>
+              <w:jc w:val="center"/>
+            </w:pPr>
+            <w:r>
+              <w:rPr>
+                <w:rFonts w:ascii="Arial" w:cs="Arial" w:eastAsia="Arial" w:hAnsi="Arial"/>
+                <w:b w:val="false"/>
+                <w:bCs w:val="false"/>
+                <w:sz w:val="18"/>
+                <w:szCs w:val="18"/>
+              </w:rPr>
+              <w:t xml:space="preserve">254 / 126</w:t>
+            </w:r>
+          </w:p>
+        </w:tc>
+        <w:tc>
+          <w:tcPr>
+            <w:tcW w:type="dxa" w:w="2088"/>
+            <w:tcBorders>
+              <w:top w:val="single" w:color="BFC5CC" w:sz="4"/>
+              <w:left w:val="single" w:color="BFC5CC" w:sz="4"/>
+              <w:bottom w:val="single" w:color="BFC5CC" w:sz="4"/>
+              <w:right w:val="single" w:color="BFC5CC" w:sz="4"/>
+            </w:tcBorders>
+            <w:tcMar>
+              <w:top w:type="dxa" w:w="50"/>
+              <w:left w:type="dxa" w:w="90"/>
+              <w:bottom w:type="dxa" w:w="50"/>
+              <w:right w:type="dxa" w:w="90"/>
+            </w:tcMar>
+          </w:tcPr>
+          <w:p>
+            <w:pPr>
+              <w:keepNext/>
+              <w:jc w:val="center"/>
+            </w:pPr>
+            <w:r>
+              <w:rPr>
+                <w:rFonts w:ascii="Arial" w:cs="Arial" w:eastAsia="Arial" w:hAnsi="Arial"/>
+                <w:b w:val="false"/>
+                <w:bCs w:val="false"/>
+                <w:sz w:val="18"/>
+                <w:szCs w:val="18"/>
+              </w:rPr>
+              <w:t xml:space="preserve">0.17-0.32</w:t>
+            </w:r>
+          </w:p>
+        </w:tc>
+      </w:tr>
+      <w:tr>
+        <w:trPr>
+          <w:cantSplit/>
+        </w:trPr>
+        <w:tc>
+          <w:tcPr>
+            <w:tcW w:type="dxa" w:w="3000"/>
+            <w:tcBorders>
+              <w:top w:val="single" w:color="BFC5CC" w:sz="4"/>
+              <w:left w:val="single" w:color="BFC5CC" w:sz="4"/>
+              <w:bottom w:val="single" w:color="BFC5CC" w:sz="4"/>
+              <w:right w:val="single" w:color="BFC5CC" w:sz="4"/>
+            </w:tcBorders>
+            <w:tcMar>
+              <w:top w:type="dxa" w:w="50"/>
+              <w:left w:type="dxa" w:w="90"/>
+              <w:bottom w:type="dxa" w:w="50"/>
+              <w:right w:type="dxa" w:w="90"/>
+            </w:tcMar>
+          </w:tcPr>
+          <w:p>
+            <w:pPr>
+              <w:keepNext/>
+              <w:jc w:val="left"/>
+            </w:pPr>
+            <w:r>
+              <w:rPr>
+                <w:rFonts w:ascii="Arial" w:cs="Arial" w:eastAsia="Arial" w:hAnsi="Arial"/>
+                <w:b w:val="false"/>
+                <w:bCs w:val="false"/>
+                <w:sz w:val="18"/>
+                <w:szCs w:val="18"/>
+              </w:rPr>
+              <w:t xml:space="preserve">Spatial + edge, 3 keyframes</w:t>
+            </w:r>
+          </w:p>
+        </w:tc>
+        <w:tc>
+          <w:tcPr>
+            <w:tcW w:type="dxa" w:w="700"/>
+            <w:tcBorders>
+              <w:top w:val="single" w:color="BFC5CC" w:sz="4"/>
+              <w:left w:val="single" w:color="BFC5CC" w:sz="4"/>
+              <w:bottom w:val="single" w:color="BFC5CC" w:sz="4"/>
+              <w:right w:val="single" w:color="BFC5CC" w:sz="4"/>
+            </w:tcBorders>
+            <w:tcMar>
+              <w:top w:type="dxa" w:w="50"/>
+              <w:left w:type="dxa" w:w="90"/>
+              <w:bottom w:type="dxa" w:w="50"/>
+              <w:right w:type="dxa" w:w="90"/>
+            </w:tcMar>
+          </w:tcPr>
+          <w:p>
+            <w:pPr>
+              <w:keepNext/>
+              <w:jc w:val="center"/>
+            </w:pPr>
+            <w:r>
+              <w:rPr>
+                <w:rFonts w:ascii="Arial" w:cs="Arial" w:eastAsia="Arial" w:hAnsi="Arial"/>
+                <w:b w:val="false"/>
+                <w:bCs w:val="false"/>
+                <w:sz w:val="18"/>
+                <w:szCs w:val="18"/>
+              </w:rPr>
+              <w:t xml:space="preserve">0.192</w:t>
+            </w:r>
+          </w:p>
+        </w:tc>
+        <w:tc>
+          <w:tcPr>
+            <w:tcW w:type="dxa" w:w="800"/>
+            <w:tcBorders>
+              <w:top w:val="single" w:color="BFC5CC" w:sz="4"/>
+              <w:left w:val="single" w:color="BFC5CC" w:sz="4"/>
+              <w:bottom w:val="single" w:color="BFC5CC" w:sz="4"/>
+              <w:right w:val="single" w:color="BFC5CC" w:sz="4"/>
+            </w:tcBorders>
+            <w:tcMar>
+              <w:top w:type="dxa" w:w="50"/>
+              <w:left w:type="dxa" w:w="90"/>
+              <w:bottom w:type="dxa" w:w="50"/>
+              <w:right w:type="dxa" w:w="90"/>
+            </w:tcMar>
+          </w:tcPr>
+          <w:p>
+            <w:pPr>
+              <w:keepNext/>
+              <w:jc w:val="center"/>
+            </w:pPr>
+            <w:r>
+              <w:rPr>
+                <w:rFonts w:ascii="Arial" w:cs="Arial" w:eastAsia="Arial" w:hAnsi="Arial"/>
+                <w:b w:val="false"/>
+                <w:bCs w:val="false"/>
+                <w:sz w:val="18"/>
+                <w:szCs w:val="18"/>
+              </w:rPr>
+              <w:t xml:space="preserve">0.244</w:t>
+            </w:r>
+          </w:p>
+        </w:tc>
+        <w:tc>
+          <w:tcPr>
+            <w:tcW w:type="dxa" w:w="700"/>
+            <w:tcBorders>
+              <w:top w:val="single" w:color="BFC5CC" w:sz="4"/>
+              <w:left w:val="single" w:color="BFC5CC" w:sz="4"/>
+              <w:bottom w:val="single" w:color="BFC5CC" w:sz="4"/>
+              <w:right w:val="single" w:color="BFC5CC" w:sz="4"/>
+            </w:tcBorders>
+            <w:tcMar>
+              <w:top w:type="dxa" w:w="50"/>
+              <w:left w:type="dxa" w:w="90"/>
+              <w:bottom w:type="dxa" w:w="50"/>
+              <w:right w:type="dxa" w:w="90"/>
+            </w:tcMar>
+          </w:tcPr>
+          <w:p>
+            <w:pPr>
+              <w:keepNext/>
+              <w:jc w:val="center"/>
+            </w:pPr>
+            <w:r>
+              <w:rPr>
+                <w:rFonts w:ascii="Arial" w:cs="Arial" w:eastAsia="Arial" w:hAnsi="Arial"/>
+                <w:b w:val="false"/>
+                <w:bCs w:val="false"/>
+                <w:sz w:val="18"/>
+                <w:szCs w:val="18"/>
+              </w:rPr>
+              <w:t xml:space="preserve">0.347</w:t>
+            </w:r>
+          </w:p>
+        </w:tc>
+        <w:tc>
+          <w:tcPr>
+            <w:tcW w:type="dxa" w:w="1100"/>
+            <w:tcBorders>
+              <w:top w:val="single" w:color="BFC5CC" w:sz="4"/>
+              <w:left w:val="single" w:color="BFC5CC" w:sz="4"/>
+              <w:bottom w:val="single" w:color="BFC5CC" w:sz="4"/>
+              <w:right w:val="single" w:color="BFC5CC" w:sz="4"/>
+            </w:tcBorders>
+            <w:tcMar>
+              <w:top w:type="dxa" w:w="50"/>
+              <w:left w:type="dxa" w:w="90"/>
+              <w:bottom w:type="dxa" w:w="50"/>
+              <w:right w:type="dxa" w:w="90"/>
+            </w:tcMar>
+          </w:tcPr>
+          <w:p>
+            <w:pPr>
+              <w:keepNext/>
+              <w:jc w:val="center"/>
+            </w:pPr>
+            <w:r>
+              <w:rPr>
+                <w:rFonts w:ascii="Arial" w:cs="Arial" w:eastAsia="Arial" w:hAnsi="Arial"/>
+                <w:b w:val="false"/>
+                <w:bCs w:val="false"/>
+                <w:sz w:val="18"/>
+                <w:szCs w:val="18"/>
+              </w:rPr>
+              <w:t xml:space="preserve">0.21 / 0.28</w:t>
+            </w:r>
+          </w:p>
+        </w:tc>
+        <w:tc>
+          <w:tcPr>
+            <w:tcW w:type="dxa" w:w="1250"/>
+            <w:tcBorders>
+              <w:top w:val="single" w:color="BFC5CC" w:sz="4"/>
+              <w:left w:val="single" w:color="BFC5CC" w:sz="4"/>
+              <w:bottom w:val="single" w:color="BFC5CC" w:sz="4"/>
+              <w:right w:val="single" w:color="BFC5CC" w:sz="4"/>
+            </w:tcBorders>
+            <w:tcMar>
+              <w:top w:type="dxa" w:w="50"/>
+              <w:left w:type="dxa" w:w="90"/>
+              <w:bottom w:type="dxa" w:w="50"/>
+              <w:right w:type="dxa" w:w="90"/>
+            </w:tcMar>
+          </w:tcPr>
+          <w:p>
+            <w:pPr>
+              <w:keepNext/>
+              <w:jc w:val="center"/>
+            </w:pPr>
+            <w:r>
+              <w:rPr>
+                <w:rFonts w:ascii="Arial" w:cs="Arial" w:eastAsia="Arial" w:hAnsi="Arial"/>
+                <w:b w:val="false"/>
+                <w:bCs w:val="false"/>
+                <w:sz w:val="18"/>
+                <w:szCs w:val="18"/>
+              </w:rPr>
+              <w:t xml:space="preserve">165 / 126</w:t>
+            </w:r>
+          </w:p>
+        </w:tc>
+        <w:tc>
+          <w:tcPr>
+            <w:tcW w:type="dxa" w:w="2088"/>
+            <w:tcBorders>
+              <w:top w:val="single" w:color="BFC5CC" w:sz="4"/>
+              <w:left w:val="single" w:color="BFC5CC" w:sz="4"/>
+              <w:bottom w:val="single" w:color="BFC5CC" w:sz="4"/>
+              <w:right w:val="single" w:color="BFC5CC" w:sz="4"/>
+            </w:tcBorders>
+            <w:tcMar>
+              <w:top w:type="dxa" w:w="50"/>
+              <w:left w:type="dxa" w:w="90"/>
+              <w:bottom w:type="dxa" w:w="50"/>
+              <w:right w:type="dxa" w:w="90"/>
+            </w:tcMar>
+          </w:tcPr>
+          <w:p>
+            <w:pPr>
+              <w:keepNext/>
+              <w:jc w:val="center"/>
+            </w:pPr>
+            <w:r>
+              <w:rPr>
+                <w:rFonts w:ascii="Arial" w:cs="Arial" w:eastAsia="Arial" w:hAnsi="Arial"/>
+                <w:b w:val="false"/>
+                <w:bCs w:val="false"/>
+                <w:sz w:val="18"/>
+                <w:szCs w:val="18"/>
+              </w:rPr>
+              <w:t xml:space="preserve">0.17-0.31</w:t>
+            </w:r>
+          </w:p>
+        </w:tc>
+      </w:tr>
+      <w:tr>
+        <w:trPr>
+          <w:cantSplit/>
+        </w:trPr>
+        <w:tc>
+          <w:tcPr>
+            <w:tcW w:type="dxa" w:w="3000"/>
+            <w:tcBorders>
+              <w:top w:val="single" w:color="BFC5CC" w:sz="4"/>
+              <w:left w:val="single" w:color="BFC5CC" w:sz="4"/>
+              <w:bottom w:val="single" w:color="BFC5CC" w:sz="4"/>
+              <w:right w:val="single" w:color="BFC5CC" w:sz="4"/>
+            </w:tcBorders>
+            <w:tcMar>
+              <w:top w:type="dxa" w:w="50"/>
+              <w:left w:type="dxa" w:w="90"/>
+              <w:bottom w:type="dxa" w:w="50"/>
+              <w:right w:type="dxa" w:w="90"/>
+            </w:tcMar>
+          </w:tcPr>
+          <w:p>
+            <w:pPr>
+              <w:keepNext/>
+              <w:jc w:val="left"/>
+            </w:pPr>
+            <w:r>
+              <w:rPr>
+                <w:rFonts w:ascii="Arial" w:cs="Arial" w:eastAsia="Arial" w:hAnsi="Arial"/>
+                <w:b w:val="false"/>
+                <w:bCs w:val="false"/>
+                <w:sz w:val="18"/>
+                <w:szCs w:val="18"/>
+              </w:rPr>
+              <w:t xml:space="preserve">Full: global + spatial + edge, 3 keyframes (main)</w:t>
+            </w:r>
+          </w:p>
+        </w:tc>
+        <w:tc>
+          <w:tcPr>
+            <w:tcW w:type="dxa" w:w="700"/>
+            <w:tcBorders>
+              <w:top w:val="single" w:color="BFC5CC" w:sz="4"/>
+              <w:left w:val="single" w:color="BFC5CC" w:sz="4"/>
+              <w:bottom w:val="single" w:color="BFC5CC" w:sz="4"/>
+              <w:right w:val="single" w:color="BFC5CC" w:sz="4"/>
+            </w:tcBorders>
+            <w:tcMar>
+              <w:top w:type="dxa" w:w="50"/>
+              <w:left w:type="dxa" w:w="90"/>
+              <w:bottom w:type="dxa" w:w="50"/>
+              <w:right w:type="dxa" w:w="90"/>
+            </w:tcMar>
+          </w:tcPr>
+          <w:p>
+            <w:pPr>
+              <w:keepNext/>
+              <w:jc w:val="center"/>
+            </w:pPr>
+            <w:r>
+              <w:rPr>
+                <w:rFonts w:ascii="Arial" w:cs="Arial" w:eastAsia="Arial" w:hAnsi="Arial"/>
+                <w:b w:val="false"/>
+                <w:bCs w:val="false"/>
+                <w:sz w:val="18"/>
+                <w:szCs w:val="18"/>
+              </w:rPr>
+              <w:t xml:space="preserve">0.284</w:t>
+            </w:r>
+          </w:p>
+        </w:tc>
+        <w:tc>
+          <w:tcPr>
+            <w:tcW w:type="dxa" w:w="800"/>
+            <w:tcBorders>
+              <w:top w:val="single" w:color="BFC5CC" w:sz="4"/>
+              <w:left w:val="single" w:color="BFC5CC" w:sz="4"/>
+              <w:bottom w:val="single" w:color="BFC5CC" w:sz="4"/>
+              <w:right w:val="single" w:color="BFC5CC" w:sz="4"/>
+            </w:tcBorders>
+            <w:tcMar>
+              <w:top w:type="dxa" w:w="50"/>
+              <w:left w:type="dxa" w:w="90"/>
+              <w:bottom w:type="dxa" w:w="50"/>
+              <w:right w:type="dxa" w:w="90"/>
+            </w:tcMar>
+          </w:tcPr>
+          <w:p>
+            <w:pPr>
+              <w:keepNext/>
+              <w:jc w:val="center"/>
+            </w:pPr>
+            <w:r>
+              <w:rPr>
+                <w:rFonts w:ascii="Arial" w:cs="Arial" w:eastAsia="Arial" w:hAnsi="Arial"/>
+                <w:b w:val="false"/>
+                <w:bCs w:val="false"/>
+                <w:sz w:val="18"/>
+                <w:szCs w:val="18"/>
+              </w:rPr>
+              <w:t xml:space="preserve">0.348</w:t>
+            </w:r>
+          </w:p>
+        </w:tc>
+        <w:tc>
+          <w:tcPr>
+            <w:tcW w:type="dxa" w:w="700"/>
+            <w:tcBorders>
+              <w:top w:val="single" w:color="BFC5CC" w:sz="4"/>
+              <w:left w:val="single" w:color="BFC5CC" w:sz="4"/>
+              <w:bottom w:val="single" w:color="BFC5CC" w:sz="4"/>
+              <w:right w:val="single" w:color="BFC5CC" w:sz="4"/>
+            </w:tcBorders>
+            <w:tcMar>
+              <w:top w:type="dxa" w:w="50"/>
+              <w:left w:type="dxa" w:w="90"/>
+              <w:bottom w:type="dxa" w:w="50"/>
+              <w:right w:type="dxa" w:w="90"/>
+            </w:tcMar>
+          </w:tcPr>
+          <w:p>
+            <w:pPr>
+              <w:keepNext/>
+              <w:jc w:val="center"/>
+            </w:pPr>
+            <w:r>
+              <w:rPr>
+                <w:rFonts w:ascii="Arial" w:cs="Arial" w:eastAsia="Arial" w:hAnsi="Arial"/>
+                <w:b w:val="false"/>
+                <w:bCs w:val="false"/>
+                <w:sz w:val="18"/>
+                <w:szCs w:val="18"/>
+              </w:rPr>
+              <w:t xml:space="preserve">0.468</w:t>
+            </w:r>
+          </w:p>
+        </w:tc>
+        <w:tc>
+          <w:tcPr>
+            <w:tcW w:type="dxa" w:w="1100"/>
+            <w:tcBorders>
+              <w:top w:val="single" w:color="BFC5CC" w:sz="4"/>
+              <w:left w:val="single" w:color="BFC5CC" w:sz="4"/>
+              <w:bottom w:val="single" w:color="BFC5CC" w:sz="4"/>
+              <w:right w:val="single" w:color="BFC5CC" w:sz="4"/>
+            </w:tcBorders>
+            <w:tcMar>
+              <w:top w:type="dxa" w:w="50"/>
+              <w:left w:type="dxa" w:w="90"/>
+              <w:bottom w:type="dxa" w:w="50"/>
+              <w:right w:type="dxa" w:w="90"/>
+            </w:tcMar>
+          </w:tcPr>
+          <w:p>
+            <w:pPr>
+              <w:keepNext/>
+              <w:jc w:val="center"/>
+            </w:pPr>
+            <w:r>
+              <w:rPr>
+                <w:rFonts w:ascii="Arial" w:cs="Arial" w:eastAsia="Arial" w:hAnsi="Arial"/>
+                <w:b w:val="false"/>
+                <w:bCs w:val="false"/>
+                <w:sz w:val="18"/>
+                <w:szCs w:val="18"/>
+              </w:rPr>
+              <w:t xml:space="preserve">0.30 / 0.42</w:t>
+            </w:r>
+          </w:p>
+        </w:tc>
+        <w:tc>
+          <w:tcPr>
+            <w:tcW w:type="dxa" w:w="1250"/>
+            <w:tcBorders>
+              <w:top w:val="single" w:color="BFC5CC" w:sz="4"/>
+              <w:left w:val="single" w:color="BFC5CC" w:sz="4"/>
+              <w:bottom w:val="single" w:color="BFC5CC" w:sz="4"/>
+              <w:right w:val="single" w:color="BFC5CC" w:sz="4"/>
+            </w:tcBorders>
+            <w:tcMar>
+              <w:top w:type="dxa" w:w="50"/>
+              <w:left w:type="dxa" w:w="90"/>
+              <w:bottom w:type="dxa" w:w="50"/>
+              <w:right w:type="dxa" w:w="90"/>
+            </w:tcMar>
+          </w:tcPr>
+          <w:p>
+            <w:pPr>
+              <w:keepNext/>
+              <w:jc w:val="center"/>
+            </w:pPr>
+            <w:r>
+              <w:rPr>
+                <w:rFonts w:ascii="Arial" w:cs="Arial" w:eastAsia="Arial" w:hAnsi="Arial"/>
+                <w:b w:val="false"/>
+                <w:bCs w:val="false"/>
+                <w:sz w:val="18"/>
+                <w:szCs w:val="18"/>
+              </w:rPr>
+              <w:t xml:space="preserve">176 / 126</w:t>
+            </w:r>
+          </w:p>
+        </w:tc>
+        <w:tc>
+          <w:tcPr>
+            <w:tcW w:type="dxa" w:w="2088"/>
+            <w:tcBorders>
+              <w:top w:val="single" w:color="BFC5CC" w:sz="4"/>
+              <w:left w:val="single" w:color="BFC5CC" w:sz="4"/>
+              <w:bottom w:val="single" w:color="BFC5CC" w:sz="4"/>
+              <w:right w:val="single" w:color="BFC5CC" w:sz="4"/>
+            </w:tcBorders>
+            <w:tcMar>
+              <w:top w:type="dxa" w:w="50"/>
+              <w:left w:type="dxa" w:w="90"/>
+              <w:bottom w:type="dxa" w:w="50"/>
+              <w:right w:type="dxa" w:w="90"/>
+            </w:tcMar>
+          </w:tcPr>
+          <w:p>
+            <w:pPr>
+              <w:keepNext/>
+              <w:jc w:val="center"/>
+            </w:pPr>
+            <w:r>
+              <w:rPr>
+                <w:rFonts w:ascii="Arial" w:cs="Arial" w:eastAsia="Arial" w:hAnsi="Arial"/>
+                <w:b w:val="false"/>
+                <w:bCs w:val="false"/>
+                <w:sz w:val="18"/>
+                <w:szCs w:val="18"/>
+              </w:rPr>
+              <w:t xml:space="preserve">0.25-0.44</w:t>
+            </w:r>
+          </w:p>
+        </w:tc>
+      </w:tr>
+      <w:tr>
+        <w:trPr>
+          <w:cantSplit/>
+        </w:trPr>
+        <w:tc>
+          <w:tcPr>
+            <w:tcW w:type="dxa" w:w="3000"/>
+            <w:tcBorders>
+              <w:top w:val="single" w:color="BFC5CC" w:sz="4"/>
+              <w:left w:val="single" w:color="BFC5CC" w:sz="4"/>
+              <w:bottom w:val="single" w:color="BFC5CC" w:sz="4"/>
+              <w:right w:val="single" w:color="BFC5CC" w:sz="4"/>
+            </w:tcBorders>
+            <w:tcMar>
+              <w:top w:type="dxa" w:w="50"/>
+              <w:left w:type="dxa" w:w="90"/>
+              <w:bottom w:type="dxa" w:w="50"/>
+              <w:right w:type="dxa" w:w="90"/>
+            </w:tcMar>
+          </w:tcPr>
+          <w:p>
+            <w:pPr>
+              <w:keepNext/>
+              <w:jc w:val="left"/>
+            </w:pPr>
+            <w:r>
+              <w:rPr>
+                <w:rFonts w:ascii="Arial" w:cs="Arial" w:eastAsia="Arial" w:hAnsi="Arial"/>
+                <w:b w:val="false"/>
+                <w:bCs w:val="false"/>
+                <w:sz w:val="18"/>
+                <w:szCs w:val="18"/>
+              </w:rPr>
+              <w:t xml:space="preserve">Full, 5 keyframes (post-hoc ablation)</w:t>
+            </w:r>
+          </w:p>
+        </w:tc>
+        <w:tc>
+          <w:tcPr>
+            <w:tcW w:type="dxa" w:w="700"/>
+            <w:tcBorders>
+              <w:top w:val="single" w:color="BFC5CC" w:sz="4"/>
+              <w:left w:val="single" w:color="BFC5CC" w:sz="4"/>
+              <w:bottom w:val="single" w:color="BFC5CC" w:sz="4"/>
+              <w:right w:val="single" w:color="BFC5CC" w:sz="4"/>
+            </w:tcBorders>
+            <w:tcMar>
+              <w:top w:type="dxa" w:w="50"/>
+              <w:left w:type="dxa" w:w="90"/>
+              <w:bottom w:type="dxa" w:w="50"/>
+              <w:right w:type="dxa" w:w="90"/>
+            </w:tcMar>
+          </w:tcPr>
+          <w:p>
+            <w:pPr>
+              <w:keepNext/>
+              <w:jc w:val="center"/>
+            </w:pPr>
+            <w:r>
+              <w:rPr>
+                <w:rFonts w:ascii="Arial" w:cs="Arial" w:eastAsia="Arial" w:hAnsi="Arial"/>
+                <w:b w:val="false"/>
+                <w:bCs w:val="false"/>
+                <w:sz w:val="18"/>
+                <w:szCs w:val="18"/>
+              </w:rPr>
+              <w:t xml:space="preserve">0.296</w:t>
+            </w:r>
+          </w:p>
+        </w:tc>
+        <w:tc>
+          <w:tcPr>
+            <w:tcW w:type="dxa" w:w="800"/>
+            <w:tcBorders>
+              <w:top w:val="single" w:color="BFC5CC" w:sz="4"/>
+              <w:left w:val="single" w:color="BFC5CC" w:sz="4"/>
+              <w:bottom w:val="single" w:color="BFC5CC" w:sz="4"/>
+              <w:right w:val="single" w:color="BFC5CC" w:sz="4"/>
+            </w:tcBorders>
+            <w:tcMar>
+              <w:top w:type="dxa" w:w="50"/>
+              <w:left w:type="dxa" w:w="90"/>
+              <w:bottom w:type="dxa" w:w="50"/>
+              <w:right w:type="dxa" w:w="90"/>
+            </w:tcMar>
+          </w:tcPr>
+          <w:p>
+            <w:pPr>
+              <w:keepNext/>
+              <w:jc w:val="center"/>
+            </w:pPr>
+            <w:r>
+              <w:rPr>
+                <w:rFonts w:ascii="Arial" w:cs="Arial" w:eastAsia="Arial" w:hAnsi="Arial"/>
+                <w:b w:val="false"/>
+                <w:bCs w:val="false"/>
+                <w:sz w:val="18"/>
+                <w:szCs w:val="18"/>
+              </w:rPr>
+              <w:t xml:space="preserve">0.361</w:t>
+            </w:r>
+          </w:p>
+        </w:tc>
+        <w:tc>
+          <w:tcPr>
+            <w:tcW w:type="dxa" w:w="700"/>
+            <w:tcBorders>
+              <w:top w:val="single" w:color="BFC5CC" w:sz="4"/>
+              <w:left w:val="single" w:color="BFC5CC" w:sz="4"/>
+              <w:bottom w:val="single" w:color="BFC5CC" w:sz="4"/>
+              <w:right w:val="single" w:color="BFC5CC" w:sz="4"/>
+            </w:tcBorders>
+            <w:tcMar>
+              <w:top w:type="dxa" w:w="50"/>
+              <w:left w:type="dxa" w:w="90"/>
+              <w:bottom w:type="dxa" w:w="50"/>
+              <w:right w:type="dxa" w:w="90"/>
+            </w:tcMar>
+          </w:tcPr>
+          <w:p>
+            <w:pPr>
+              <w:keepNext/>
+              <w:jc w:val="center"/>
+            </w:pPr>
+            <w:r>
+              <w:rPr>
+                <w:rFonts w:ascii="Arial" w:cs="Arial" w:eastAsia="Arial" w:hAnsi="Arial"/>
+                <w:b w:val="false"/>
+                <w:bCs w:val="false"/>
+                <w:sz w:val="18"/>
+                <w:szCs w:val="18"/>
+              </w:rPr>
+              <w:t xml:space="preserve">0.462</w:t>
+            </w:r>
+          </w:p>
+        </w:tc>
+        <w:tc>
+          <w:tcPr>
+            <w:tcW w:type="dxa" w:w="1100"/>
+            <w:tcBorders>
+              <w:top w:val="single" w:color="BFC5CC" w:sz="4"/>
+              <w:left w:val="single" w:color="BFC5CC" w:sz="4"/>
+              <w:bottom w:val="single" w:color="BFC5CC" w:sz="4"/>
+              <w:right w:val="single" w:color="BFC5CC" w:sz="4"/>
+            </w:tcBorders>
+            <w:tcMar>
+              <w:top w:type="dxa" w:w="50"/>
+              <w:left w:type="dxa" w:w="90"/>
+              <w:bottom w:type="dxa" w:w="50"/>
+              <w:right w:type="dxa" w:w="90"/>
+            </w:tcMar>
+          </w:tcPr>
+          <w:p>
+            <w:pPr>
+              <w:keepNext/>
+              <w:jc w:val="center"/>
+            </w:pPr>
+            <w:r>
+              <w:rPr>
+                <w:rFonts w:ascii="Arial" w:cs="Arial" w:eastAsia="Arial" w:hAnsi="Arial"/>
+                <w:b w:val="false"/>
+                <w:bCs w:val="false"/>
+                <w:sz w:val="18"/>
+                <w:szCs w:val="18"/>
+              </w:rPr>
+              <w:t xml:space="preserve">0.31 / 0.43</w:t>
+            </w:r>
+          </w:p>
+        </w:tc>
+        <w:tc>
+          <w:tcPr>
+            <w:tcW w:type="dxa" w:w="1250"/>
+            <w:tcBorders>
+              <w:top w:val="single" w:color="BFC5CC" w:sz="4"/>
+              <w:left w:val="single" w:color="BFC5CC" w:sz="4"/>
+              <w:bottom w:val="single" w:color="BFC5CC" w:sz="4"/>
+              <w:right w:val="single" w:color="BFC5CC" w:sz="4"/>
+            </w:tcBorders>
+            <w:tcMar>
+              <w:top w:type="dxa" w:w="50"/>
+              <w:left w:type="dxa" w:w="90"/>
+              <w:bottom w:type="dxa" w:w="50"/>
+              <w:right w:type="dxa" w:w="90"/>
+            </w:tcMar>
+          </w:tcPr>
+          <w:p>
+            <w:pPr>
+              <w:keepNext/>
+              <w:jc w:val="center"/>
+            </w:pPr>
+            <w:r>
+              <w:rPr>
+                <w:rFonts w:ascii="Arial" w:cs="Arial" w:eastAsia="Arial" w:hAnsi="Arial"/>
+                <w:b w:val="false"/>
+                <w:bCs w:val="false"/>
+                <w:sz w:val="18"/>
+                <w:szCs w:val="18"/>
+              </w:rPr>
+              <w:t xml:space="preserve">171 / 126</w:t>
+            </w:r>
+          </w:p>
+        </w:tc>
+        <w:tc>
+          <w:tcPr>
+            <w:tcW w:type="dxa" w:w="2088"/>
+            <w:tcBorders>
+              <w:top w:val="single" w:color="BFC5CC" w:sz="4"/>
+              <w:left w:val="single" w:color="BFC5CC" w:sz="4"/>
+              <w:bottom w:val="single" w:color="BFC5CC" w:sz="4"/>
+              <w:right w:val="single" w:color="BFC5CC" w:sz="4"/>
+            </w:tcBorders>
+            <w:tcMar>
+              <w:top w:type="dxa" w:w="50"/>
+              <w:left w:type="dxa" w:w="90"/>
+              <w:bottom w:type="dxa" w:w="50"/>
+              <w:right w:type="dxa" w:w="90"/>
+            </w:tcMar>
+          </w:tcPr>
+          <w:p>
+            <w:pPr>
+              <w:keepNext/>
+              <w:jc w:val="center"/>
+            </w:pPr>
+            <w:r>
+              <w:rPr>
+                <w:rFonts w:ascii="Arial" w:cs="Arial" w:eastAsia="Arial" w:hAnsi="Arial"/>
+                <w:b w:val="false"/>
+                <w:bCs w:val="false"/>
+                <w:sz w:val="18"/>
+                <w:szCs w:val="18"/>
+              </w:rPr>
+              <w:t xml:space="preserve">0.27-0.45</w:t>
+            </w:r>
+          </w:p>
+        </w:tc>
+      </w:tr>
+      <w:tr>
+        <w:trPr>
+          <w:cantSplit/>
+        </w:trPr>
+        <w:tc>
+          <w:tcPr>
+            <w:tcW w:type="dxa" w:w="3000"/>
+            <w:tcBorders>
+              <w:top w:val="single" w:color="BFC5CC" w:sz="4"/>
+              <w:left w:val="single" w:color="BFC5CC" w:sz="4"/>
+              <w:bottom w:val="single" w:color="BFC5CC" w:sz="4"/>
+              <w:right w:val="single" w:color="BFC5CC" w:sz="4"/>
+            </w:tcBorders>
+            <w:tcMar>
+              <w:top w:type="dxa" w:w="50"/>
+              <w:left w:type="dxa" w:w="90"/>
+              <w:bottom w:type="dxa" w:w="50"/>
+              <w:right w:type="dxa" w:w="90"/>
+            </w:tcMar>
+          </w:tcPr>
+          <w:p>
+            <w:pPr>
+              <w:keepNext/>
+              <w:jc w:val="left"/>
+            </w:pPr>
+            <w:r>
+              <w:rPr>
+                <w:rFonts w:ascii="Arial" w:cs="Arial" w:eastAsia="Arial" w:hAnsi="Arial"/>
+                <w:b w:val="false"/>
+                <w:bCs w:val="false"/>
+                <w:sz w:val="18"/>
+                <w:szCs w:val="18"/>
+              </w:rPr>
+              <w:t xml:space="preserve">Baseline: every detected cut is a boundary</w:t>
+            </w:r>
+          </w:p>
+        </w:tc>
+        <w:tc>
+          <w:tcPr>
+            <w:tcW w:type="dxa" w:w="700"/>
+            <w:tcBorders>
+              <w:top w:val="single" w:color="BFC5CC" w:sz="4"/>
+              <w:left w:val="single" w:color="BFC5CC" w:sz="4"/>
+              <w:bottom w:val="single" w:color="BFC5CC" w:sz="4"/>
+              <w:right w:val="single" w:color="BFC5CC" w:sz="4"/>
+            </w:tcBorders>
+            <w:tcMar>
+              <w:top w:type="dxa" w:w="50"/>
+              <w:left w:type="dxa" w:w="90"/>
+              <w:bottom w:type="dxa" w:w="50"/>
+              <w:right w:type="dxa" w:w="90"/>
+            </w:tcMar>
+          </w:tcPr>
+          <w:p>
+            <w:pPr>
+              <w:keepNext/>
+              <w:jc w:val="center"/>
+            </w:pPr>
+            <w:r>
+              <w:rPr>
+                <w:rFonts w:ascii="Arial" w:cs="Arial" w:eastAsia="Arial" w:hAnsi="Arial"/>
+                <w:b w:val="false"/>
+                <w:bCs w:val="false"/>
+                <w:sz w:val="18"/>
+                <w:szCs w:val="18"/>
+              </w:rPr>
+              <w:t xml:space="preserve">0.156</w:t>
+            </w:r>
+          </w:p>
+        </w:tc>
+        <w:tc>
+          <w:tcPr>
+            <w:tcW w:type="dxa" w:w="800"/>
+            <w:tcBorders>
+              <w:top w:val="single" w:color="BFC5CC" w:sz="4"/>
+              <w:left w:val="single" w:color="BFC5CC" w:sz="4"/>
+              <w:bottom w:val="single" w:color="BFC5CC" w:sz="4"/>
+              <w:right w:val="single" w:color="BFC5CC" w:sz="4"/>
+            </w:tcBorders>
+            <w:tcMar>
+              <w:top w:type="dxa" w:w="50"/>
+              <w:left w:type="dxa" w:w="90"/>
+              <w:bottom w:type="dxa" w:w="50"/>
+              <w:right w:type="dxa" w:w="90"/>
+            </w:tcMar>
+          </w:tcPr>
+          <w:p>
+            <w:pPr>
+              <w:keepNext/>
+              <w:jc w:val="center"/>
+            </w:pPr>
+            <w:r>
+              <w:rPr>
+                <w:rFonts w:ascii="Arial" w:cs="Arial" w:eastAsia="Arial" w:hAnsi="Arial"/>
+                <w:b w:val="false"/>
+                <w:bCs w:val="false"/>
+                <w:sz w:val="18"/>
+                <w:szCs w:val="18"/>
+              </w:rPr>
+              <w:t xml:space="preserve">0.167</w:t>
+            </w:r>
+          </w:p>
+        </w:tc>
+        <w:tc>
+          <w:tcPr>
+            <w:tcW w:type="dxa" w:w="700"/>
+            <w:tcBorders>
+              <w:top w:val="single" w:color="BFC5CC" w:sz="4"/>
+              <w:left w:val="single" w:color="BFC5CC" w:sz="4"/>
+              <w:bottom w:val="single" w:color="BFC5CC" w:sz="4"/>
+              <w:right w:val="single" w:color="BFC5CC" w:sz="4"/>
+            </w:tcBorders>
+            <w:tcMar>
+              <w:top w:type="dxa" w:w="50"/>
+              <w:left w:type="dxa" w:w="90"/>
+              <w:bottom w:type="dxa" w:w="50"/>
+              <w:right w:type="dxa" w:w="90"/>
+            </w:tcMar>
+          </w:tcPr>
+          <w:p>
+            <w:pPr>
+              <w:keepNext/>
+              <w:jc w:val="center"/>
+            </w:pPr>
+            <w:r>
+              <w:rPr>
+                <w:rFonts w:ascii="Arial" w:cs="Arial" w:eastAsia="Arial" w:hAnsi="Arial"/>
+                <w:b w:val="false"/>
+                <w:bCs w:val="false"/>
+                <w:sz w:val="18"/>
+                <w:szCs w:val="18"/>
+              </w:rPr>
+              <w:t xml:space="preserve">0.179</w:t>
+            </w:r>
+          </w:p>
+        </w:tc>
+        <w:tc>
+          <w:tcPr>
+            <w:tcW w:type="dxa" w:w="1100"/>
+            <w:tcBorders>
+              <w:top w:val="single" w:color="BFC5CC" w:sz="4"/>
+              <w:left w:val="single" w:color="BFC5CC" w:sz="4"/>
+              <w:bottom w:val="single" w:color="BFC5CC" w:sz="4"/>
+              <w:right w:val="single" w:color="BFC5CC" w:sz="4"/>
+            </w:tcBorders>
+            <w:tcMar>
+              <w:top w:type="dxa" w:w="50"/>
+              <w:left w:type="dxa" w:w="90"/>
+              <w:bottom w:type="dxa" w:w="50"/>
+              <w:right w:type="dxa" w:w="90"/>
+            </w:tcMar>
+          </w:tcPr>
+          <w:p>
+            <w:pPr>
+              <w:keepNext/>
+              <w:jc w:val="center"/>
+            </w:pPr>
+            <w:r>
+              <w:rPr>
+                <w:rFonts w:ascii="Arial" w:cs="Arial" w:eastAsia="Arial" w:hAnsi="Arial"/>
+                <w:b w:val="false"/>
+                <w:bCs w:val="false"/>
+                <w:sz w:val="18"/>
+                <w:szCs w:val="18"/>
+              </w:rPr>
+              <w:t xml:space="preserve">0.09 / 0.91</w:t>
+            </w:r>
+          </w:p>
+        </w:tc>
+        <w:tc>
+          <w:tcPr>
+            <w:tcW w:type="dxa" w:w="1250"/>
+            <w:tcBorders>
+              <w:top w:val="single" w:color="BFC5CC" w:sz="4"/>
+              <w:left w:val="single" w:color="BFC5CC" w:sz="4"/>
+              <w:bottom w:val="single" w:color="BFC5CC" w:sz="4"/>
+              <w:right w:val="single" w:color="BFC5CC" w:sz="4"/>
+            </w:tcBorders>
+            <w:tcMar>
+              <w:top w:type="dxa" w:w="50"/>
+              <w:left w:type="dxa" w:w="90"/>
+              <w:bottom w:type="dxa" w:w="50"/>
+              <w:right w:type="dxa" w:w="90"/>
+            </w:tcMar>
+          </w:tcPr>
+          <w:p>
+            <w:pPr>
+              <w:keepNext/>
+              <w:jc w:val="center"/>
+            </w:pPr>
+            <w:r>
+              <w:rPr>
+                <w:rFonts w:ascii="Arial" w:cs="Arial" w:eastAsia="Arial" w:hAnsi="Arial"/>
+                <w:b w:val="false"/>
+                <w:bCs w:val="false"/>
+                <w:sz w:val="18"/>
+                <w:szCs w:val="18"/>
+              </w:rPr>
+              <w:t xml:space="preserve">-</w:t>
+            </w:r>
+          </w:p>
+        </w:tc>
+        <w:tc>
+          <w:tcPr>
+            <w:tcW w:type="dxa" w:w="2088"/>
+            <w:tcBorders>
+              <w:top w:val="single" w:color="BFC5CC" w:sz="4"/>
+              <w:left w:val="single" w:color="BFC5CC" w:sz="4"/>
+              <w:bottom w:val="single" w:color="BFC5CC" w:sz="4"/>
+              <w:right w:val="single" w:color="BFC5CC" w:sz="4"/>
+            </w:tcBorders>
+            <w:tcMar>
+              <w:top w:type="dxa" w:w="50"/>
+              <w:left w:type="dxa" w:w="90"/>
+              <w:bottom w:type="dxa" w:w="50"/>
+              <w:right w:type="dxa" w:w="90"/>
+            </w:tcMar>
+          </w:tcPr>
+          <w:p>
+            <w:pPr>
+              <w:keepNext/>
+              <w:jc w:val="center"/>
+            </w:pPr>
+            <w:r>
+              <w:rPr>
+                <w:rFonts w:ascii="Arial" w:cs="Arial" w:eastAsia="Arial" w:hAnsi="Arial"/>
+                <w:b w:val="false"/>
+                <w:bCs w:val="false"/>
+                <w:sz w:val="18"/>
+                <w:szCs w:val="18"/>
+              </w:rPr>
+              <w:t xml:space="preserve">0.13-0.21</w:t>
+            </w:r>
+          </w:p>
+        </w:tc>
+      </w:tr>
+      <w:tr>
+        <w:trPr>
+          <w:cantSplit/>
+        </w:trPr>
+        <w:tc>
+          <w:tcPr>
+            <w:tcW w:type="dxa" w:w="3000"/>
             <w:tcBorders>
               <w:top w:val="single" w:color="BFC5CC" w:sz="4"/>
               <w:left w:val="single" w:color="BFC5CC" w:sz="4"/>
@@ -15799,13 +18238,13 @@
                 <w:sz w:val="18"/>
                 <w:szCs w:val="18"/>
               </w:rPr>
-              <w:t xml:space="preserve">Evenly spaced boundaries, videos 6-10</w:t>
-            </w:r>
-          </w:p>
-        </w:tc>
-        <w:tc>
-          <w:tcPr>
-            <w:tcW w:type="dxa" w:w="1100"/>
+              <w:t xml:space="preserve">Baseline: evenly spaced, true number of scenes</w:t>
+            </w:r>
+          </w:p>
+        </w:tc>
+        <w:tc>
+          <w:tcPr>
+            <w:tcW w:type="dxa" w:w="700"/>
             <w:tcBorders>
               <w:top w:val="single" w:color="BFC5CC" w:sz="4"/>
               <w:left w:val="single" w:color="BFC5CC" w:sz="4"/>
@@ -15832,13 +18271,13 @@
                 <w:sz w:val="18"/>
                 <w:szCs w:val="18"/>
               </w:rPr>
-              <w:t xml:space="preserve">-</w:t>
-            </w:r>
-          </w:p>
-        </w:tc>
-        <w:tc>
-          <w:tcPr>
-            <w:tcW w:type="dxa" w:w="1300"/>
+              <w:t xml:space="preserve">0.017</w:t>
+            </w:r>
+          </w:p>
+        </w:tc>
+        <w:tc>
+          <w:tcPr>
+            <w:tcW w:type="dxa" w:w="800"/>
             <w:tcBorders>
               <w:top w:val="single" w:color="BFC5CC" w:sz="4"/>
               <w:left w:val="single" w:color="BFC5CC" w:sz="4"/>
@@ -15865,13 +18304,13 @@
                 <w:sz w:val="18"/>
                 <w:szCs w:val="18"/>
               </w:rPr>
-              <w:t xml:space="preserve">0.039</w:t>
-            </w:r>
-          </w:p>
-        </w:tc>
-        <w:tc>
-          <w:tcPr>
-            <w:tcW w:type="dxa" w:w="1100"/>
+              <w:t xml:space="preserve">0.043</w:t>
+            </w:r>
+          </w:p>
+        </w:tc>
+        <w:tc>
+          <w:tcPr>
+            <w:tcW w:type="dxa" w:w="700"/>
             <w:tcBorders>
               <w:top w:val="single" w:color="BFC5CC" w:sz="4"/>
               <w:left w:val="single" w:color="BFC5CC" w:sz="4"/>
@@ -15898,13 +18337,13 @@
                 <w:sz w:val="18"/>
                 <w:szCs w:val="18"/>
               </w:rPr>
-              <w:t xml:space="preserve">0.118</w:t>
-            </w:r>
-          </w:p>
-        </w:tc>
-        <w:tc>
-          <w:tcPr>
-            <w:tcW w:type="dxa" w:w="2038"/>
+              <w:t xml:space="preserve">0.172</w:t>
+            </w:r>
+          </w:p>
+        </w:tc>
+        <w:tc>
+          <w:tcPr>
+            <w:tcW w:type="dxa" w:w="1100"/>
             <w:tcBorders>
               <w:top w:val="single" w:color="BFC5CC" w:sz="4"/>
               <w:left w:val="single" w:color="BFC5CC" w:sz="4"/>
@@ -15931,7 +18370,73 @@
                 <w:sz w:val="18"/>
                 <w:szCs w:val="18"/>
               </w:rPr>
+              <w:t xml:space="preserve">0.04 / 0.04</w:t>
+            </w:r>
+          </w:p>
+        </w:tc>
+        <w:tc>
+          <w:tcPr>
+            <w:tcW w:type="dxa" w:w="1250"/>
+            <w:tcBorders>
+              <w:top w:val="single" w:color="BFC5CC" w:sz="4"/>
+              <w:left w:val="single" w:color="BFC5CC" w:sz="4"/>
+              <w:bottom w:val="single" w:color="BFC5CC" w:sz="4"/>
+              <w:right w:val="single" w:color="BFC5CC" w:sz="4"/>
+            </w:tcBorders>
+            <w:tcMar>
+              <w:top w:type="dxa" w:w="50"/>
+              <w:left w:type="dxa" w:w="90"/>
+              <w:bottom w:type="dxa" w:w="50"/>
+              <w:right w:type="dxa" w:w="90"/>
+            </w:tcMar>
+          </w:tcPr>
+          <w:p>
+            <w:pPr>
+              <w:keepNext w:val="false"/>
+              <w:jc w:val="center"/>
+            </w:pPr>
+            <w:r>
+              <w:rPr>
+                <w:rFonts w:ascii="Arial" w:cs="Arial" w:eastAsia="Arial" w:hAnsi="Arial"/>
+                <w:b w:val="false"/>
+                <w:bCs w:val="false"/>
+                <w:sz w:val="18"/>
+                <w:szCs w:val="18"/>
+              </w:rPr>
               <w:t xml:space="preserve">-</w:t>
+            </w:r>
+          </w:p>
+        </w:tc>
+        <w:tc>
+          <w:tcPr>
+            <w:tcW w:type="dxa" w:w="2088"/>
+            <w:tcBorders>
+              <w:top w:val="single" w:color="BFC5CC" w:sz="4"/>
+              <w:left w:val="single" w:color="BFC5CC" w:sz="4"/>
+              <w:bottom w:val="single" w:color="BFC5CC" w:sz="4"/>
+              <w:right w:val="single" w:color="BFC5CC" w:sz="4"/>
+            </w:tcBorders>
+            <w:tcMar>
+              <w:top w:type="dxa" w:w="50"/>
+              <w:left w:type="dxa" w:w="90"/>
+              <w:bottom w:type="dxa" w:w="50"/>
+              <w:right w:type="dxa" w:w="90"/>
+            </w:tcMar>
+          </w:tcPr>
+          <w:p>
+            <w:pPr>
+              <w:keepNext w:val="false"/>
+              <w:jc w:val="center"/>
+            </w:pPr>
+            <w:r>
+              <w:rPr>
+                <w:rFonts w:ascii="Arial" w:cs="Arial" w:eastAsia="Arial" w:hAnsi="Arial"/>
+                <w:b w:val="false"/>
+                <w:bCs w:val="false"/>
+                <w:sz w:val="18"/>
+                <w:szCs w:val="18"/>
+              </w:rPr>
+              <w:t xml:space="preserve">0.01-0.07</w:t>
             </w:r>
           </w:p>
         </w:tc>
@@ -15944,30 +18449,30 @@
     </w:p>
     <w:p>
       <w:pPr>
-        <w:pBdr>
-          <w:left w:val="single" w:color="D97706" w:sz="18" w:space="6"/>
-        </w:pBdr>
-        <w:shd w:fill="FFF7E0" w:val="clear"/>
-        <w:spacing w:after="140" w:before="60" w:line="264"/>
+        <w:pStyle w:val="Heading2"/>
+        <w:keepNext/>
+        <w:spacing w:after="100" w:before="220"/>
       </w:pPr>
       <w:r>
         <w:rPr>
           <w:rFonts w:ascii="Arial" w:cs="Arial" w:eastAsia="Arial" w:hAnsi="Arial"/>
           <w:b/>
           <w:bCs/>
-        </w:rPr>
-        <w:t xml:space="preserve">Reading this honestly.</w:t>
-      </w:r>
-      <w:r>
-        <w:rPr>
-          <w:rFonts w:ascii="Arial" w:cs="Arial" w:eastAsia="Arial" w:hAnsi="Arial"/>
-        </w:rPr>
-        <w:t xml:space="preserve"> The 0.446 score was measured on the same videos used for tuning and does not transfer. On unseen videos the scene layer scores about 0.13 at 2 s, only slightly above random guessing (0.07). Of every 100 boundaries it outputs about 15 are right, and it finds about 12 of every 100 true ones. The scene layer is not accurate on real footage with the features used here.</w:t>
-      </w:r>
-    </w:p>
-    <w:p>
-      <w:pPr>
-        <w:spacing w:after="120" w:line="276"/>
+          <w:color w:val="1F3A5F"/>
+          <w:sz w:val="24"/>
+          <w:szCs w:val="24"/>
+        </w:rPr>
+        <w:t xml:space="preserve">Interpretation</w:t>
+      </w:r>
+    </w:p>
+    <w:p>
+      <w:pPr>
+        <w:pStyle w:val="ListParagraph"/>
+        <w:numPr>
+          <w:ilvl w:val="0"/>
+          <w:numId w:val="3"/>
+        </w:numPr>
+        <w:spacing w:after="60" w:line="264"/>
       </w:pPr>
       <w:r>
         <w:rPr>
@@ -15975,13 +18480,128 @@
           <w:b/>
           <w:bCs/>
         </w:rPr>
-        <w:t xml:space="preserve">Why scene grouping is hard here.</w:t>
-      </w:r>
-      <w:r>
-        <w:rPr>
-          <w:rFonts w:ascii="Arial" w:cs="Arial" w:eastAsia="Arial" w:hAnsi="Arial"/>
-        </w:rPr>
-        <w:t xml:space="preserve"> A cut is visual; a scene boundary is about meaning (a change of topic or place). Our only feature is a 64-bucket colour histogram, which cannot capture meaning. Liu et al. report F1 of 0.67-0.72 using learned features on movies and TV drama, which is not comparable to our setting. Improving the features (for example a grid of histograms) evaluated by cross-validation over all 10 videos is the natural next step and is not part of these results.</w:t>
+        <w:t xml:space="preserve">The honest scene score is now about 0.35 (F1 at 2 s), not 0.13.</w:t>
+      </w:r>
+      <w:r>
+        <w:rPr>
+          <w:rFonts w:ascii="Arial" w:cs="Arial" w:eastAsia="Arial" w:hAnsi="Arial"/>
+        </w:rPr>
+        <w:t xml:space="preserve"> Most of that change is better tuning and evaluation, not better features: the old method scores 0.29 when tuned over 10 videos with held-out testing. The earlier 0.13 came from tuning on only 5 videos with a small grid, so the two numbers are not directly comparable.</w:t>
+      </w:r>
+    </w:p>
+    <w:p>
+      <w:pPr>
+        <w:pStyle w:val="ListParagraph"/>
+        <w:numPr>
+          <w:ilvl w:val="0"/>
+          <w:numId w:val="3"/>
+        </w:numPr>
+        <w:spacing w:after="60" w:line="264"/>
+      </w:pPr>
+      <w:r>
+        <w:rPr>
+          <w:rFonts w:ascii="Arial" w:cs="Arial" w:eastAsia="Arial" w:hAnsi="Arial"/>
+          <w:b/>
+          <w:bCs/>
+        </w:rPr>
+        <w:t xml:space="preserve">Richer features help only a little, and the evidence is weak.</w:t>
+      </w:r>
+      <w:r>
+        <w:rPr>
+          <w:rFonts w:ascii="Arial" w:cs="Arial" w:eastAsia="Arial" w:hAnsi="Arial"/>
+        </w:rPr>
+        <w:t xml:space="preserve"> The full descriptor beats the old method by about 0.06, but the intervals overlap heavily; with 116 boundaries this is not a proven gain. One keyframe with the plain histogram already reaches 0.30. The spatial grid alone (0.29) and the edge feature alone (0.24) did not help; only the combination did.</w:t>
+      </w:r>
+    </w:p>
+    <w:p>
+      <w:pPr>
+        <w:pStyle w:val="ListParagraph"/>
+        <w:numPr>
+          <w:ilvl w:val="0"/>
+          <w:numId w:val="3"/>
+        </w:numPr>
+        <w:spacing w:after="60" w:line="264"/>
+      </w:pPr>
+      <w:r>
+        <w:rPr>
+          <w:rFonts w:ascii="Arial" w:cs="Arial" w:eastAsia="Arial" w:hAnsi="Arial"/>
+          <w:b/>
+          <w:bCs/>
+        </w:rPr>
+        <w:t xml:space="preserve">It now clearly beats the trivial baselines</w:t>
+      </w:r>
+      <w:r>
+        <w:rPr>
+          <w:rFonts w:ascii="Arial" w:cs="Arial" w:eastAsia="Arial" w:hAnsi="Arial"/>
+        </w:rPr>
+        <w:t xml:space="preserve"> (every-cut 0.167, interval 0.13-0.21), which is the real bar.</w:t>
+      </w:r>
+    </w:p>
+    <w:p>
+      <w:pPr>
+        <w:pStyle w:val="ListParagraph"/>
+        <w:numPr>
+          <w:ilvl w:val="0"/>
+          <w:numId w:val="3"/>
+        </w:numPr>
+        <w:spacing w:after="60" w:line="264"/>
+      </w:pPr>
+      <w:r>
+        <w:rPr>
+          <w:rFonts w:ascii="Arial" w:cs="Arial" w:eastAsia="Arial" w:hAnsi="Arial"/>
+          <w:b/>
+          <w:bCs/>
+        </w:rPr>
+        <w:t xml:space="preserve">It still over-splits:</w:t>
+      </w:r>
+      <w:r>
+        <w:rPr>
+          <w:rFonts w:ascii="Arial" w:cs="Arial" w:eastAsia="Arial" w:hAnsi="Arial"/>
+        </w:rPr>
+        <w:t xml:space="preserve"> 176 predicted scenes against 126 true ones.</w:t>
+      </w:r>
+    </w:p>
+    <w:p>
+      <w:pPr>
+        <w:pStyle w:val="ListParagraph"/>
+        <w:numPr>
+          <w:ilvl w:val="0"/>
+          <w:numId w:val="3"/>
+        </w:numPr>
+        <w:spacing w:after="60" w:line="264"/>
+      </w:pPr>
+      <w:r>
+        <w:rPr>
+          <w:rFonts w:ascii="Arial" w:cs="Arial" w:eastAsia="Arial" w:hAnsi="Arial"/>
+          <w:b/>
+          <w:bCs/>
+        </w:rPr>
+        <w:t xml:space="preserve">Remaining optimism.</w:t>
+      </w:r>
+      <w:r>
+        <w:rPr>
+          <w:rFonts w:ascii="Arial" w:cs="Arial" w:eastAsia="Arial" w:hAnsi="Arial"/>
+        </w:rPr>
+        <w:t xml:space="preserve"> About 8 feature sets x 672 parameter sets were searched. The held-out protocol removes tuning leakage, but reporting the best row would still be mildly optimistic, which is why the main method was fixed in advance. The 5-keyframe row is a post-hoc extra. The chosen new-scene cost was the same in every fold and is not at the edge of the (widened) grid.</w:t>
+      </w:r>
+    </w:p>
+    <w:p>
+      <w:pPr>
+        <w:spacing w:after="120" w:line="276"/>
+      </w:pPr>
+      <w:r>
+        <w:rPr>
+          <w:rFonts w:ascii="Arial" w:cs="Arial" w:eastAsia="Arial" w:hAnsi="Arial"/>
+          <w:b/>
+          <w:bCs/>
+        </w:rPr>
+        <w:t xml:space="preserve">Why scene grouping stays hard.</w:t>
+      </w:r>
+      <w:r>
+        <w:rPr>
+          <w:rFonts w:ascii="Arial" w:cs="Arial" w:eastAsia="Arial" w:hAnsi="Arial"/>
+        </w:rPr>
+        <w:t xml:space="preserve"> A cut is visual; a scene boundary is about meaning (a change of topic or place). Colour and edge statistics cannot capture meaning. Liu et al. report F1 of 0.67-0.72 using learned features on movies and TV drama, which is not comparable to this setting. Learned embeddings are the next step and are not part of this work.</w:t>
       </w:r>
     </w:p>
     <w:p>
@@ -16257,7 +18877,7 @@
         <w:rPr>
           <w:rFonts w:ascii="Arial" w:cs="Arial" w:eastAsia="Arial" w:hAnsi="Arial"/>
         </w:rPr>
-        <w:t xml:space="preserve"> is a simplified Liu et al. (no EM or MI-SVM, hand-set parameters, DP is our interpretation). Its accuracy on human labels is close to chance (F1 about 0.13 on held-out videos).</w:t>
+        <w:t xml:space="preserve"> is a simplified Liu et al. (no EM or MI-SVM, fixed 1:1:1 block weights, DP is our interpretation). On human labels it reaches F1 about 0.35 at 2 s tolerance (interval 0.25-0.44) on a small test set of 116 boundaries; the gain from richer classical features over a tuned global histogram is not statistically established.</w:t>
       </w:r>
     </w:p>
     <w:p>
@@ -16334,7 +18954,7 @@
         <w:rPr>
           <w:rFonts w:ascii="Arial" w:cs="Arial" w:eastAsia="Arial" w:hAnsi="Arial"/>
         </w:rPr>
-        <w:t xml:space="preserve">A chunk-based data-parallel design in C with POSIX threads, per-thread file handles, a mutex-guarded chunk counter and a post-merge threshold produces bit-identical results at every worker count and reaches about 5.2x speedup (60,000 frames per second against 11,700) on a 12-thread CPU across 11 real videos. Scaling is near-linear to 4 workers and then limited by overhead and contention, not serial code. A task-parallel pipeline scaled worse (peak 3.8x). Hard-cut detection agrees well with an independent detector (F1 0.91). The scene layer's similarity stage parallelises, but its dynamic-programming stages do not, capping that layer near 2.3x; and its accuracy against human scene labels is weak, which we report rather than hide.</w:t>
+        <w:t xml:space="preserve">A chunk-based data-parallel design in C with POSIX threads, per-thread file handles, a mutex-guarded chunk counter and a post-merge threshold produces bit-identical results at every worker count and reaches about 5.2x speedup (60,000 frames per second against 11,700) on a 12-thread CPU across 11 real videos. Scaling is near-linear to 4 workers and then limited by overhead and contention, not serial code. A task-parallel pipeline scaled worse (peak 3.8x). Hard-cut detection agrees well with an independent detector (F1 0.91). The scene layer's similarity stage parallelises, but its dynamic-programming stages do not, capping that layer near 2.3x; and with leave-one-video-out tuning its accuracy against human scene labels is moderate (F1 about 0.35 at 2 s, against 0.17 for the best trivial baseline), with richer classical features adding little beyond tuning.</w:t>
       </w:r>
     </w:p>
     <w:p>
@@ -16903,7 +19523,7 @@
                 <w:sz w:val="18"/>
                 <w:szCs w:val="18"/>
               </w:rPr>
-              <w:t xml:space="preserve">c/main.c</w:t>
+              <w:t xml:space="preserve">c/features.[ch], c/scene_api.c</w:t>
             </w:r>
           </w:p>
         </w:tc>
@@ -16936,7 +19556,7 @@
                 <w:sz w:val="18"/>
                 <w:szCs w:val="18"/>
               </w:rPr>
-              <w:t xml:space="preserve">command-line front end</w:t>
+              <w:t xml:space="preserve">keyframe descriptors (parallel over shots); flat C entry point used by Python</w:t>
             </w:r>
           </w:p>
         </w:tc>
@@ -16974,7 +19594,7 @@
                 <w:sz w:val="18"/>
                 <w:szCs w:val="18"/>
               </w:rPr>
-              <w:t xml:space="preserve">tools/gen_synth.py, evaluate.py, eval_rai.py, tune_scenes.py</w:t>
+              <w:t xml:space="preserve">c/main.c</w:t>
             </w:r>
           </w:p>
         </w:tc>
@@ -17007,7 +19627,7 @@
                 <w:sz w:val="18"/>
                 <w:szCs w:val="18"/>
               </w:rPr>
-              <w:t xml:space="preserve">synthetic data, F1 scoring, RAI evaluation, parameter search</w:t>
+              <w:t xml:space="preserve">command-line front end</w:t>
             </w:r>
           </w:p>
         </w:tc>
@@ -17045,7 +19665,7 @@
                 <w:sz w:val="18"/>
                 <w:szCs w:val="18"/>
               </w:rPr>
-              <w:t xml:space="preserve">tools/study.py, plot_study.py, benchmark.py</w:t>
+              <w:t xml:space="preserve">tools/gen_synth.py, evaluate.py, eval_rai.py, tune_scenes.py</w:t>
             </w:r>
           </w:p>
         </w:tc>
@@ -17078,7 +19698,7 @@
                 <w:sz w:val="18"/>
                 <w:szCs w:val="18"/>
               </w:rPr>
-              <w:t xml:space="preserve">main worker study, figure and table, supporting experiments</w:t>
+              <w:t xml:space="preserve">synthetic data, F1 scoring, RAI evaluation, early parameter search</w:t>
             </w:r>
           </w:p>
         </w:tc>
@@ -17105,6 +19725,148 @@
           </w:tcPr>
           <w:p>
             <w:pPr>
+              <w:keepNext/>
+              <w:jc w:val="left"/>
+            </w:pPr>
+            <w:r>
+              <w:rPr>
+                <w:rFonts w:ascii="Arial" w:cs="Arial" w:eastAsia="Arial" w:hAnsi="Arial"/>
+                <w:b w:val="false"/>
+                <w:bCs w:val="false"/>
+                <w:sz w:val="18"/>
+                <w:szCs w:val="18"/>
+              </w:rPr>
+              <w:t xml:space="preserve">tools/scene_metrics.py, scene_lib.py, audit_metric.py, scene_cv.py</w:t>
+            </w:r>
+          </w:p>
+        </w:tc>
+        <w:tc>
+          <w:tcPr>
+            <w:tcW w:type="dxa" w:w="6038"/>
+            <w:tcBorders>
+              <w:top w:val="single" w:color="BFC5CC" w:sz="4"/>
+              <w:left w:val="single" w:color="BFC5CC" w:sz="4"/>
+              <w:bottom w:val="single" w:color="BFC5CC" w:sz="4"/>
+              <w:right w:val="single" w:color="BFC5CC" w:sz="4"/>
+            </w:tcBorders>
+            <w:tcMar>
+              <w:top w:type="dxa" w:w="50"/>
+              <w:left w:type="dxa" w:w="90"/>
+              <w:bottom w:type="dxa" w:w="50"/>
+              <w:right w:type="dxa" w:w="90"/>
+            </w:tcMar>
+          </w:tcPr>
+          <w:p>
+            <w:pPr>
+              <w:keepNext/>
+              <w:jc w:val="left"/>
+            </w:pPr>
+            <w:r>
+              <w:rPr>
+                <w:rFonts w:ascii="Arial" w:cs="Arial" w:eastAsia="Arial" w:hAnsi="Arial"/>
+                <w:b w:val="false"/>
+                <w:bCs w:val="false"/>
+                <w:sz w:val="18"/>
+                <w:szCs w:val="18"/>
+              </w:rPr>
+              <w:t xml:space="preserve">scene metrics, ctypes access to the C scene layer, metric audit, leave-one-video-out study</w:t>
+            </w:r>
+          </w:p>
+        </w:tc>
+      </w:tr>
+      <w:tr>
+        <w:trPr>
+          <w:cantSplit/>
+        </w:trPr>
+        <w:tc>
+          <w:tcPr>
+            <w:tcW w:type="dxa" w:w="3600"/>
+            <w:tcBorders>
+              <w:top w:val="single" w:color="BFC5CC" w:sz="4"/>
+              <w:left w:val="single" w:color="BFC5CC" w:sz="4"/>
+              <w:bottom w:val="single" w:color="BFC5CC" w:sz="4"/>
+              <w:right w:val="single" w:color="BFC5CC" w:sz="4"/>
+            </w:tcBorders>
+            <w:tcMar>
+              <w:top w:type="dxa" w:w="50"/>
+              <w:left w:type="dxa" w:w="90"/>
+              <w:bottom w:type="dxa" w:w="50"/>
+              <w:right w:type="dxa" w:w="90"/>
+            </w:tcMar>
+          </w:tcPr>
+          <w:p>
+            <w:pPr>
+              <w:keepNext/>
+              <w:jc w:val="left"/>
+            </w:pPr>
+            <w:r>
+              <w:rPr>
+                <w:rFonts w:ascii="Arial" w:cs="Arial" w:eastAsia="Arial" w:hAnsi="Arial"/>
+                <w:b w:val="false"/>
+                <w:bCs w:val="false"/>
+                <w:sz w:val="18"/>
+                <w:szCs w:val="18"/>
+              </w:rPr>
+              <w:t xml:space="preserve">tools/study.py, plot_study.py, benchmark.py</w:t>
+            </w:r>
+          </w:p>
+        </w:tc>
+        <w:tc>
+          <w:tcPr>
+            <w:tcW w:type="dxa" w:w="6038"/>
+            <w:tcBorders>
+              <w:top w:val="single" w:color="BFC5CC" w:sz="4"/>
+              <w:left w:val="single" w:color="BFC5CC" w:sz="4"/>
+              <w:bottom w:val="single" w:color="BFC5CC" w:sz="4"/>
+              <w:right w:val="single" w:color="BFC5CC" w:sz="4"/>
+            </w:tcBorders>
+            <w:tcMar>
+              <w:top w:type="dxa" w:w="50"/>
+              <w:left w:type="dxa" w:w="90"/>
+              <w:bottom w:type="dxa" w:w="50"/>
+              <w:right w:type="dxa" w:w="90"/>
+            </w:tcMar>
+          </w:tcPr>
+          <w:p>
+            <w:pPr>
+              <w:keepNext/>
+              <w:jc w:val="left"/>
+            </w:pPr>
+            <w:r>
+              <w:rPr>
+                <w:rFonts w:ascii="Arial" w:cs="Arial" w:eastAsia="Arial" w:hAnsi="Arial"/>
+                <w:b w:val="false"/>
+                <w:bCs w:val="false"/>
+                <w:sz w:val="18"/>
+                <w:szCs w:val="18"/>
+              </w:rPr>
+              <w:t xml:space="preserve">main worker study, figure and table, supporting experiments</w:t>
+            </w:r>
+          </w:p>
+        </w:tc>
+      </w:tr>
+      <w:tr>
+        <w:trPr>
+          <w:cantSplit/>
+        </w:trPr>
+        <w:tc>
+          <w:tcPr>
+            <w:tcW w:type="dxa" w:w="3600"/>
+            <w:tcBorders>
+              <w:top w:val="single" w:color="BFC5CC" w:sz="4"/>
+              <w:left w:val="single" w:color="BFC5CC" w:sz="4"/>
+              <w:bottom w:val="single" w:color="BFC5CC" w:sz="4"/>
+              <w:right w:val="single" w:color="BFC5CC" w:sz="4"/>
+            </w:tcBorders>
+            <w:tcMar>
+              <w:top w:type="dxa" w:w="50"/>
+              <w:left w:type="dxa" w:w="90"/>
+              <w:bottom w:type="dxa" w:w="50"/>
+              <w:right w:type="dxa" w:w="90"/>
+            </w:tcMar>
+          </w:tcPr>
+          <w:p>
+            <w:pPr>
               <w:keepNext w:val="false"/>
               <w:jc w:val="left"/>
             </w:pPr>
@@ -17204,7 +19966,7 @@
           <w:sz w:val="16"/>
           <w:szCs w:val="16"/>
         </w:rPr>
-        <w:t xml:space="preserve">    c/seq.c c/arch_a.c c/arch_b.c c/scenes.c c/scene_bench.c -lm</w:t>
+        <w:t xml:space="preserve">    c/seq.c c/arch_a.c c/arch_b.c c/scenes.c c/scene_bench.c c/features.c -lm</w:t>
       </w:r>
     </w:p>
     <w:p>

</xml_diff>